<commit_message>
Merged new details into english user manual
</commit_message>
<xml_diff>
--- a/Documentation/Official Documentation/User's manual for IBOS MusicXmlReader version 5.0.0.0.docx
+++ b/Documentation/Official Documentation/User's manual for IBOS MusicXmlReader version 5.0.0.0.docx
@@ -14,39 +14,39 @@
           <w:sz w:val="40"/>
           <w:szCs w:val="40"/>
         </w:rPr>
-        <w:t xml:space="preserve">User’s </w:t>
-      </w:r>
+        <w:t>User’s Manual for</w:t>
+      </w:r>
+    </w:p>
+    <w:p>
+      <w:pPr>
+        <w:pStyle w:val="Titel"/>
+        <w:rPr/>
+      </w:pPr>
       <w:r>
         <w:rPr>
           <w:rFonts w:ascii="Verdana" w:hAnsi="Verdana"/>
           <w:sz w:val="40"/>
           <w:szCs w:val="40"/>
         </w:rPr>
-        <w:t>Manual</w:t>
+        <w:t xml:space="preserve">IBOS MusicXmlReader version </w:t>
       </w:r>
       <w:r>
         <w:rPr>
           <w:rFonts w:ascii="Verdana" w:hAnsi="Verdana"/>
+          <w:color w:val="C9211E"/>
           <w:sz w:val="40"/>
           <w:szCs w:val="40"/>
         </w:rPr>
-        <w:t xml:space="preserve"> for</w:t>
-      </w:r>
-    </w:p>
-    <w:p>
-      <w:pPr>
-        <w:pStyle w:val="Titel"/>
-        <w:rPr>
-          <w:rFonts w:ascii="Verdana" w:hAnsi="Verdana" w:cs="Verdana"/>
-        </w:rPr>
-      </w:pPr>
+        <w:t>5</w:t>
+      </w:r>
       <w:r>
         <w:rPr>
           <w:rFonts w:ascii="Verdana" w:hAnsi="Verdana"/>
+          <w:color w:val="C9211E"/>
           <w:sz w:val="40"/>
           <w:szCs w:val="40"/>
         </w:rPr>
-        <w:t>IBOS MusicXmlReader version 4.0.0.0</w:t>
+        <w:t>.0.0.0</w:t>
       </w:r>
     </w:p>
     <w:p>
@@ -1344,14 +1344,14 @@
         </w:tblCellMar>
       </w:tblPr>
       <w:tblGrid>
-        <w:gridCol w:w="1682"/>
-        <w:gridCol w:w="7493"/>
+        <w:gridCol w:w="1681"/>
+        <w:gridCol w:w="7494"/>
       </w:tblGrid>
       <w:tr>
         <w:trPr/>
         <w:tc>
           <w:tcPr>
-            <w:tcW w:w="1682" w:type="dxa"/>
+            <w:tcW w:w="1681" w:type="dxa"/>
             <w:tcBorders>
               <w:top w:val="single" w:sz="4" w:space="0" w:color="000000"/>
               <w:left w:val="single" w:sz="4" w:space="0" w:color="000000"/>
@@ -1379,7 +1379,7 @@
         </w:tc>
         <w:tc>
           <w:tcPr>
-            <w:tcW w:w="7493" w:type="dxa"/>
+            <w:tcW w:w="7494" w:type="dxa"/>
             <w:tcBorders>
               <w:top w:val="single" w:sz="4" w:space="0" w:color="000000"/>
               <w:left w:val="single" w:sz="4" w:space="0" w:color="000000"/>
@@ -1421,7 +1421,7 @@
         <w:trPr/>
         <w:tc>
           <w:tcPr>
-            <w:tcW w:w="1682" w:type="dxa"/>
+            <w:tcW w:w="1681" w:type="dxa"/>
             <w:tcBorders>
               <w:top w:val="single" w:sz="4" w:space="0" w:color="000000"/>
               <w:left w:val="single" w:sz="4" w:space="0" w:color="000000"/>
@@ -1451,7 +1451,7 @@
         </w:tc>
         <w:tc>
           <w:tcPr>
-            <w:tcW w:w="7493" w:type="dxa"/>
+            <w:tcW w:w="7494" w:type="dxa"/>
             <w:tcBorders>
               <w:top w:val="single" w:sz="4" w:space="0" w:color="000000"/>
               <w:left w:val="single" w:sz="4" w:space="0" w:color="000000"/>
@@ -1519,7 +1519,7 @@
         <w:trPr/>
         <w:tc>
           <w:tcPr>
-            <w:tcW w:w="1682" w:type="dxa"/>
+            <w:tcW w:w="1681" w:type="dxa"/>
             <w:tcBorders>
               <w:top w:val="single" w:sz="4" w:space="0" w:color="000000"/>
               <w:left w:val="single" w:sz="4" w:space="0" w:color="000000"/>
@@ -1547,7 +1547,7 @@
         </w:tc>
         <w:tc>
           <w:tcPr>
-            <w:tcW w:w="7493" w:type="dxa"/>
+            <w:tcW w:w="7494" w:type="dxa"/>
             <w:tcBorders>
               <w:top w:val="single" w:sz="4" w:space="0" w:color="000000"/>
               <w:left w:val="single" w:sz="4" w:space="0" w:color="000000"/>
@@ -1577,7 +1577,7 @@
         <w:trPr/>
         <w:tc>
           <w:tcPr>
-            <w:tcW w:w="1682" w:type="dxa"/>
+            <w:tcW w:w="1681" w:type="dxa"/>
             <w:tcBorders>
               <w:top w:val="single" w:sz="4" w:space="0" w:color="000000"/>
               <w:left w:val="single" w:sz="4" w:space="0" w:color="000000"/>
@@ -1605,7 +1605,7 @@
         </w:tc>
         <w:tc>
           <w:tcPr>
-            <w:tcW w:w="7493" w:type="dxa"/>
+            <w:tcW w:w="7494" w:type="dxa"/>
             <w:tcBorders>
               <w:top w:val="single" w:sz="4" w:space="0" w:color="000000"/>
               <w:left w:val="single" w:sz="4" w:space="0" w:color="000000"/>
@@ -1651,7 +1651,7 @@
         <w:trPr/>
         <w:tc>
           <w:tcPr>
-            <w:tcW w:w="1682" w:type="dxa"/>
+            <w:tcW w:w="1681" w:type="dxa"/>
             <w:tcBorders>
               <w:top w:val="single" w:sz="4" w:space="0" w:color="000000"/>
               <w:left w:val="single" w:sz="4" w:space="0" w:color="000000"/>
@@ -1684,7 +1684,7 @@
         </w:tc>
         <w:tc>
           <w:tcPr>
-            <w:tcW w:w="7493" w:type="dxa"/>
+            <w:tcW w:w="7494" w:type="dxa"/>
             <w:tcBorders>
               <w:top w:val="single" w:sz="4" w:space="0" w:color="000000"/>
               <w:left w:val="single" w:sz="4" w:space="0" w:color="000000"/>
@@ -2230,9 +2230,9 @@
         </w:tblCellMar>
       </w:tblPr>
       <w:tblGrid>
-        <w:gridCol w:w="1582"/>
+        <w:gridCol w:w="1581"/>
         <w:gridCol w:w="5219"/>
-        <w:gridCol w:w="2214"/>
+        <w:gridCol w:w="2215"/>
       </w:tblGrid>
       <w:tr>
         <w:trPr>
@@ -2240,7 +2240,7 @@
         </w:trPr>
         <w:tc>
           <w:tcPr>
-            <w:tcW w:w="1582" w:type="dxa"/>
+            <w:tcW w:w="1581" w:type="dxa"/>
             <w:tcBorders>
               <w:top w:val="single" w:sz="2" w:space="0" w:color="000000"/>
               <w:left w:val="single" w:sz="2" w:space="0" w:color="000000"/>
@@ -2310,7 +2310,7 @@
         </w:tc>
         <w:tc>
           <w:tcPr>
-            <w:tcW w:w="2214" w:type="dxa"/>
+            <w:tcW w:w="2215" w:type="dxa"/>
             <w:tcBorders>
               <w:top w:val="single" w:sz="2" w:space="0" w:color="000000"/>
               <w:left w:val="single" w:sz="2" w:space="0" w:color="000000"/>
@@ -2341,7 +2341,7 @@
         <w:trPr/>
         <w:tc>
           <w:tcPr>
-            <w:tcW w:w="1582" w:type="dxa"/>
+            <w:tcW w:w="1581" w:type="dxa"/>
             <w:tcBorders>
               <w:left w:val="single" w:sz="2" w:space="0" w:color="000000"/>
               <w:bottom w:val="single" w:sz="2" w:space="0" w:color="000000"/>
@@ -2405,7 +2405,7 @@
         </w:tc>
         <w:tc>
           <w:tcPr>
-            <w:tcW w:w="2214" w:type="dxa"/>
+            <w:tcW w:w="2215" w:type="dxa"/>
             <w:tcBorders>
               <w:left w:val="single" w:sz="2" w:space="0" w:color="000000"/>
               <w:bottom w:val="single" w:sz="2" w:space="0" w:color="000000"/>
@@ -2432,7 +2432,7 @@
         <w:trPr/>
         <w:tc>
           <w:tcPr>
-            <w:tcW w:w="1582" w:type="dxa"/>
+            <w:tcW w:w="1581" w:type="dxa"/>
             <w:tcBorders>
               <w:left w:val="single" w:sz="2" w:space="0" w:color="000000"/>
               <w:bottom w:val="single" w:sz="2" w:space="0" w:color="000000"/>
@@ -2493,7 +2493,7 @@
         </w:tc>
         <w:tc>
           <w:tcPr>
-            <w:tcW w:w="2214" w:type="dxa"/>
+            <w:tcW w:w="2215" w:type="dxa"/>
             <w:tcBorders>
               <w:left w:val="single" w:sz="2" w:space="0" w:color="000000"/>
               <w:bottom w:val="single" w:sz="2" w:space="0" w:color="000000"/>
@@ -2520,7 +2520,7 @@
         <w:trPr/>
         <w:tc>
           <w:tcPr>
-            <w:tcW w:w="1582" w:type="dxa"/>
+            <w:tcW w:w="1581" w:type="dxa"/>
             <w:tcBorders>
               <w:left w:val="single" w:sz="2" w:space="0" w:color="000000"/>
               <w:bottom w:val="single" w:sz="2" w:space="0" w:color="000000"/>
@@ -2567,7 +2567,7 @@
         </w:tc>
         <w:tc>
           <w:tcPr>
-            <w:tcW w:w="2214" w:type="dxa"/>
+            <w:tcW w:w="2215" w:type="dxa"/>
             <w:tcBorders>
               <w:left w:val="single" w:sz="2" w:space="0" w:color="000000"/>
               <w:bottom w:val="single" w:sz="2" w:space="0" w:color="000000"/>
@@ -2612,7 +2612,7 @@
         <w:trPr/>
         <w:tc>
           <w:tcPr>
-            <w:tcW w:w="1582" w:type="dxa"/>
+            <w:tcW w:w="1581" w:type="dxa"/>
             <w:tcBorders>
               <w:left w:val="single" w:sz="2" w:space="0" w:color="000000"/>
               <w:bottom w:val="single" w:sz="2" w:space="0" w:color="000000"/>
@@ -2661,7 +2661,7 @@
         </w:tc>
         <w:tc>
           <w:tcPr>
-            <w:tcW w:w="2214" w:type="dxa"/>
+            <w:tcW w:w="2215" w:type="dxa"/>
             <w:tcBorders>
               <w:left w:val="single" w:sz="2" w:space="0" w:color="000000"/>
               <w:bottom w:val="single" w:sz="2" w:space="0" w:color="000000"/>
@@ -2691,7 +2691,7 @@
         <w:trPr/>
         <w:tc>
           <w:tcPr>
-            <w:tcW w:w="1582" w:type="dxa"/>
+            <w:tcW w:w="1581" w:type="dxa"/>
             <w:tcBorders>
               <w:left w:val="single" w:sz="2" w:space="0" w:color="000000"/>
               <w:bottom w:val="single" w:sz="2" w:space="0" w:color="000000"/>
@@ -2740,7 +2740,7 @@
         </w:tc>
         <w:tc>
           <w:tcPr>
-            <w:tcW w:w="2214" w:type="dxa"/>
+            <w:tcW w:w="2215" w:type="dxa"/>
             <w:tcBorders>
               <w:left w:val="single" w:sz="2" w:space="0" w:color="000000"/>
               <w:bottom w:val="single" w:sz="2" w:space="0" w:color="000000"/>
@@ -2770,7 +2770,7 @@
         <w:trPr/>
         <w:tc>
           <w:tcPr>
-            <w:tcW w:w="1582" w:type="dxa"/>
+            <w:tcW w:w="1581" w:type="dxa"/>
             <w:tcBorders>
               <w:left w:val="single" w:sz="2" w:space="0" w:color="000000"/>
               <w:bottom w:val="single" w:sz="2" w:space="0" w:color="000000"/>
@@ -2819,7 +2819,7 @@
         </w:tc>
         <w:tc>
           <w:tcPr>
-            <w:tcW w:w="2214" w:type="dxa"/>
+            <w:tcW w:w="2215" w:type="dxa"/>
             <w:tcBorders>
               <w:left w:val="single" w:sz="2" w:space="0" w:color="000000"/>
               <w:bottom w:val="single" w:sz="2" w:space="0" w:color="000000"/>
@@ -2849,7 +2849,7 @@
         <w:trPr/>
         <w:tc>
           <w:tcPr>
-            <w:tcW w:w="1582" w:type="dxa"/>
+            <w:tcW w:w="1581" w:type="dxa"/>
             <w:tcBorders>
               <w:left w:val="single" w:sz="2" w:space="0" w:color="000000"/>
               <w:bottom w:val="single" w:sz="2" w:space="0" w:color="000000"/>
@@ -2895,7 +2895,7 @@
         </w:tc>
         <w:tc>
           <w:tcPr>
-            <w:tcW w:w="2214" w:type="dxa"/>
+            <w:tcW w:w="2215" w:type="dxa"/>
             <w:tcBorders>
               <w:left w:val="single" w:sz="2" w:space="0" w:color="000000"/>
               <w:bottom w:val="single" w:sz="2" w:space="0" w:color="000000"/>
@@ -2925,7 +2925,7 @@
         <w:trPr/>
         <w:tc>
           <w:tcPr>
-            <w:tcW w:w="1582" w:type="dxa"/>
+            <w:tcW w:w="1581" w:type="dxa"/>
             <w:tcBorders>
               <w:left w:val="single" w:sz="2" w:space="0" w:color="000000"/>
               <w:bottom w:val="single" w:sz="2" w:space="0" w:color="000000"/>
@@ -2985,7 +2985,7 @@
         </w:tc>
         <w:tc>
           <w:tcPr>
-            <w:tcW w:w="2214" w:type="dxa"/>
+            <w:tcW w:w="2215" w:type="dxa"/>
             <w:tcBorders>
               <w:left w:val="single" w:sz="2" w:space="0" w:color="000000"/>
               <w:bottom w:val="single" w:sz="2" w:space="0" w:color="000000"/>
@@ -3019,7 +3019,7 @@
         <w:trPr/>
         <w:tc>
           <w:tcPr>
-            <w:tcW w:w="1582" w:type="dxa"/>
+            <w:tcW w:w="1581" w:type="dxa"/>
             <w:tcBorders>
               <w:left w:val="single" w:sz="2" w:space="0" w:color="000000"/>
               <w:bottom w:val="single" w:sz="2" w:space="0" w:color="000000"/>
@@ -3079,7 +3079,7 @@
         </w:tc>
         <w:tc>
           <w:tcPr>
-            <w:tcW w:w="2214" w:type="dxa"/>
+            <w:tcW w:w="2215" w:type="dxa"/>
             <w:tcBorders>
               <w:left w:val="single" w:sz="2" w:space="0" w:color="000000"/>
               <w:bottom w:val="single" w:sz="2" w:space="0" w:color="000000"/>
@@ -3113,7 +3113,7 @@
         <w:trPr/>
         <w:tc>
           <w:tcPr>
-            <w:tcW w:w="1582" w:type="dxa"/>
+            <w:tcW w:w="1581" w:type="dxa"/>
             <w:tcBorders>
               <w:left w:val="single" w:sz="2" w:space="0" w:color="000000"/>
               <w:bottom w:val="single" w:sz="2" w:space="0" w:color="000000"/>
@@ -3173,7 +3173,7 @@
         </w:tc>
         <w:tc>
           <w:tcPr>
-            <w:tcW w:w="2214" w:type="dxa"/>
+            <w:tcW w:w="2215" w:type="dxa"/>
             <w:tcBorders>
               <w:left w:val="single" w:sz="2" w:space="0" w:color="000000"/>
               <w:bottom w:val="single" w:sz="2" w:space="0" w:color="000000"/>
@@ -3206,7 +3206,7 @@
         <w:trPr/>
         <w:tc>
           <w:tcPr>
-            <w:tcW w:w="1582" w:type="dxa"/>
+            <w:tcW w:w="1581" w:type="dxa"/>
             <w:tcBorders>
               <w:left w:val="single" w:sz="2" w:space="0" w:color="000000"/>
               <w:bottom w:val="single" w:sz="2" w:space="0" w:color="000000"/>
@@ -3255,7 +3255,7 @@
         </w:tc>
         <w:tc>
           <w:tcPr>
-            <w:tcW w:w="2214" w:type="dxa"/>
+            <w:tcW w:w="2215" w:type="dxa"/>
             <w:tcBorders>
               <w:left w:val="single" w:sz="2" w:space="0" w:color="000000"/>
               <w:bottom w:val="single" w:sz="2" w:space="0" w:color="000000"/>
@@ -3285,7 +3285,7 @@
         <w:trPr/>
         <w:tc>
           <w:tcPr>
-            <w:tcW w:w="1582" w:type="dxa"/>
+            <w:tcW w:w="1581" w:type="dxa"/>
             <w:tcBorders>
               <w:left w:val="single" w:sz="2" w:space="0" w:color="000000"/>
               <w:bottom w:val="single" w:sz="2" w:space="0" w:color="000000"/>
@@ -3339,7 +3339,7 @@
         </w:tc>
         <w:tc>
           <w:tcPr>
-            <w:tcW w:w="2214" w:type="dxa"/>
+            <w:tcW w:w="2215" w:type="dxa"/>
             <w:tcBorders>
               <w:left w:val="single" w:sz="2" w:space="0" w:color="000000"/>
               <w:bottom w:val="single" w:sz="2" w:space="0" w:color="000000"/>
@@ -3371,7 +3371,7 @@
         <w:trPr/>
         <w:tc>
           <w:tcPr>
-            <w:tcW w:w="1582" w:type="dxa"/>
+            <w:tcW w:w="1581" w:type="dxa"/>
             <w:tcBorders>
               <w:left w:val="single" w:sz="2" w:space="0" w:color="000000"/>
               <w:bottom w:val="single" w:sz="2" w:space="0" w:color="000000"/>
@@ -3423,7 +3423,7 @@
         </w:tc>
         <w:tc>
           <w:tcPr>
-            <w:tcW w:w="2214" w:type="dxa"/>
+            <w:tcW w:w="2215" w:type="dxa"/>
             <w:tcBorders>
               <w:left w:val="single" w:sz="2" w:space="0" w:color="000000"/>
               <w:bottom w:val="single" w:sz="2" w:space="0" w:color="000000"/>
@@ -3453,7 +3453,7 @@
         <w:trPr/>
         <w:tc>
           <w:tcPr>
-            <w:tcW w:w="1582" w:type="dxa"/>
+            <w:tcW w:w="1581" w:type="dxa"/>
             <w:tcBorders>
               <w:left w:val="single" w:sz="2" w:space="0" w:color="000000"/>
               <w:bottom w:val="single" w:sz="2" w:space="0" w:color="000000"/>
@@ -3507,7 +3507,7 @@
         </w:tc>
         <w:tc>
           <w:tcPr>
-            <w:tcW w:w="2214" w:type="dxa"/>
+            <w:tcW w:w="2215" w:type="dxa"/>
             <w:tcBorders>
               <w:left w:val="single" w:sz="2" w:space="0" w:color="000000"/>
               <w:bottom w:val="single" w:sz="2" w:space="0" w:color="000000"/>
@@ -3537,7 +3537,7 @@
         <w:trPr/>
         <w:tc>
           <w:tcPr>
-            <w:tcW w:w="1582" w:type="dxa"/>
+            <w:tcW w:w="1581" w:type="dxa"/>
             <w:tcBorders>
               <w:left w:val="single" w:sz="2" w:space="0" w:color="000000"/>
               <w:bottom w:val="single" w:sz="2" w:space="0" w:color="000000"/>
@@ -3591,7 +3591,7 @@
         </w:tc>
         <w:tc>
           <w:tcPr>
-            <w:tcW w:w="2214" w:type="dxa"/>
+            <w:tcW w:w="2215" w:type="dxa"/>
             <w:tcBorders>
               <w:left w:val="single" w:sz="2" w:space="0" w:color="000000"/>
               <w:bottom w:val="single" w:sz="2" w:space="0" w:color="000000"/>
@@ -3621,7 +3621,7 @@
         <w:trPr/>
         <w:tc>
           <w:tcPr>
-            <w:tcW w:w="1582" w:type="dxa"/>
+            <w:tcW w:w="1581" w:type="dxa"/>
             <w:tcBorders>
               <w:left w:val="single" w:sz="2" w:space="0" w:color="000000"/>
               <w:bottom w:val="single" w:sz="2" w:space="0" w:color="000000"/>
@@ -3675,7 +3675,7 @@
         </w:tc>
         <w:tc>
           <w:tcPr>
-            <w:tcW w:w="2214" w:type="dxa"/>
+            <w:tcW w:w="2215" w:type="dxa"/>
             <w:tcBorders>
               <w:left w:val="single" w:sz="2" w:space="0" w:color="000000"/>
               <w:bottom w:val="single" w:sz="2" w:space="0" w:color="000000"/>
@@ -3705,7 +3705,7 @@
         <w:trPr/>
         <w:tc>
           <w:tcPr>
-            <w:tcW w:w="1582" w:type="dxa"/>
+            <w:tcW w:w="1581" w:type="dxa"/>
             <w:tcBorders>
               <w:left w:val="single" w:sz="2" w:space="0" w:color="000000"/>
               <w:bottom w:val="single" w:sz="2" w:space="0" w:color="000000"/>
@@ -3757,7 +3757,7 @@
         </w:tc>
         <w:tc>
           <w:tcPr>
-            <w:tcW w:w="2214" w:type="dxa"/>
+            <w:tcW w:w="2215" w:type="dxa"/>
             <w:tcBorders>
               <w:left w:val="single" w:sz="2" w:space="0" w:color="000000"/>
               <w:bottom w:val="single" w:sz="2" w:space="0" w:color="000000"/>
@@ -3787,7 +3787,7 @@
         <w:trPr/>
         <w:tc>
           <w:tcPr>
-            <w:tcW w:w="1582" w:type="dxa"/>
+            <w:tcW w:w="1581" w:type="dxa"/>
             <w:tcBorders>
               <w:left w:val="single" w:sz="2" w:space="0" w:color="000000"/>
               <w:bottom w:val="single" w:sz="2" w:space="0" w:color="000000"/>
@@ -3839,7 +3839,7 @@
         </w:tc>
         <w:tc>
           <w:tcPr>
-            <w:tcW w:w="2214" w:type="dxa"/>
+            <w:tcW w:w="2215" w:type="dxa"/>
             <w:tcBorders>
               <w:left w:val="single" w:sz="2" w:space="0" w:color="000000"/>
               <w:bottom w:val="single" w:sz="2" w:space="0" w:color="000000"/>
@@ -3869,7 +3869,7 @@
         <w:trPr/>
         <w:tc>
           <w:tcPr>
-            <w:tcW w:w="1582" w:type="dxa"/>
+            <w:tcW w:w="1581" w:type="dxa"/>
             <w:tcBorders>
               <w:left w:val="single" w:sz="2" w:space="0" w:color="000000"/>
               <w:bottom w:val="single" w:sz="2" w:space="0" w:color="000000"/>
@@ -3922,7 +3922,7 @@
         </w:tc>
         <w:tc>
           <w:tcPr>
-            <w:tcW w:w="2214" w:type="dxa"/>
+            <w:tcW w:w="2215" w:type="dxa"/>
             <w:tcBorders>
               <w:left w:val="single" w:sz="2" w:space="0" w:color="000000"/>
               <w:bottom w:val="single" w:sz="2" w:space="0" w:color="000000"/>
@@ -3952,7 +3952,7 @@
         <w:trPr/>
         <w:tc>
           <w:tcPr>
-            <w:tcW w:w="1582" w:type="dxa"/>
+            <w:tcW w:w="1581" w:type="dxa"/>
             <w:tcBorders>
               <w:left w:val="single" w:sz="2" w:space="0" w:color="000000"/>
               <w:bottom w:val="single" w:sz="2" w:space="0" w:color="000000"/>
@@ -4005,7 +4005,7 @@
         </w:tc>
         <w:tc>
           <w:tcPr>
-            <w:tcW w:w="2214" w:type="dxa"/>
+            <w:tcW w:w="2215" w:type="dxa"/>
             <w:tcBorders>
               <w:left w:val="single" w:sz="2" w:space="0" w:color="000000"/>
               <w:bottom w:val="single" w:sz="2" w:space="0" w:color="000000"/>
@@ -4035,7 +4035,7 @@
         <w:trPr/>
         <w:tc>
           <w:tcPr>
-            <w:tcW w:w="1582" w:type="dxa"/>
+            <w:tcW w:w="1581" w:type="dxa"/>
             <w:tcBorders>
               <w:left w:val="single" w:sz="2" w:space="0" w:color="000000"/>
               <w:bottom w:val="single" w:sz="2" w:space="0" w:color="000000"/>
@@ -4088,7 +4088,7 @@
         </w:tc>
         <w:tc>
           <w:tcPr>
-            <w:tcW w:w="2214" w:type="dxa"/>
+            <w:tcW w:w="2215" w:type="dxa"/>
             <w:tcBorders>
               <w:left w:val="single" w:sz="2" w:space="0" w:color="000000"/>
               <w:bottom w:val="single" w:sz="2" w:space="0" w:color="000000"/>
@@ -4118,7 +4118,7 @@
         <w:trPr/>
         <w:tc>
           <w:tcPr>
-            <w:tcW w:w="1582" w:type="dxa"/>
+            <w:tcW w:w="1581" w:type="dxa"/>
             <w:tcBorders>
               <w:left w:val="single" w:sz="2" w:space="0" w:color="000000"/>
               <w:bottom w:val="single" w:sz="2" w:space="0" w:color="000000"/>
@@ -4170,7 +4170,7 @@
         </w:tc>
         <w:tc>
           <w:tcPr>
-            <w:tcW w:w="2214" w:type="dxa"/>
+            <w:tcW w:w="2215" w:type="dxa"/>
             <w:tcBorders>
               <w:left w:val="single" w:sz="2" w:space="0" w:color="000000"/>
               <w:bottom w:val="single" w:sz="2" w:space="0" w:color="000000"/>
@@ -4200,7 +4200,7 @@
         <w:trPr/>
         <w:tc>
           <w:tcPr>
-            <w:tcW w:w="1582" w:type="dxa"/>
+            <w:tcW w:w="1581" w:type="dxa"/>
             <w:tcBorders>
               <w:left w:val="single" w:sz="2" w:space="0" w:color="000000"/>
               <w:bottom w:val="single" w:sz="2" w:space="0" w:color="000000"/>
@@ -4255,7 +4255,7 @@
         </w:tc>
         <w:tc>
           <w:tcPr>
-            <w:tcW w:w="2214" w:type="dxa"/>
+            <w:tcW w:w="2215" w:type="dxa"/>
             <w:tcBorders>
               <w:left w:val="single" w:sz="2" w:space="0" w:color="000000"/>
               <w:bottom w:val="single" w:sz="2" w:space="0" w:color="000000"/>
@@ -4285,7 +4285,7 @@
         <w:trPr/>
         <w:tc>
           <w:tcPr>
-            <w:tcW w:w="1582" w:type="dxa"/>
+            <w:tcW w:w="1581" w:type="dxa"/>
             <w:tcBorders>
               <w:left w:val="single" w:sz="2" w:space="0" w:color="000000"/>
               <w:bottom w:val="single" w:sz="2" w:space="0" w:color="000000"/>
@@ -4341,7 +4341,7 @@
         </w:tc>
         <w:tc>
           <w:tcPr>
-            <w:tcW w:w="2214" w:type="dxa"/>
+            <w:tcW w:w="2215" w:type="dxa"/>
             <w:tcBorders>
               <w:left w:val="single" w:sz="2" w:space="0" w:color="000000"/>
               <w:bottom w:val="single" w:sz="2" w:space="0" w:color="000000"/>
@@ -4371,7 +4371,7 @@
         <w:trPr/>
         <w:tc>
           <w:tcPr>
-            <w:tcW w:w="1582" w:type="dxa"/>
+            <w:tcW w:w="1581" w:type="dxa"/>
             <w:tcBorders>
               <w:left w:val="single" w:sz="2" w:space="0" w:color="000000"/>
               <w:bottom w:val="single" w:sz="2" w:space="0" w:color="000000"/>
@@ -4427,7 +4427,7 @@
         </w:tc>
         <w:tc>
           <w:tcPr>
-            <w:tcW w:w="2214" w:type="dxa"/>
+            <w:tcW w:w="2215" w:type="dxa"/>
             <w:tcBorders>
               <w:left w:val="single" w:sz="2" w:space="0" w:color="000000"/>
               <w:bottom w:val="single" w:sz="2" w:space="0" w:color="000000"/>
@@ -4459,7 +4459,7 @@
         <w:trPr/>
         <w:tc>
           <w:tcPr>
-            <w:tcW w:w="1582" w:type="dxa"/>
+            <w:tcW w:w="1581" w:type="dxa"/>
             <w:tcBorders>
               <w:left w:val="single" w:sz="2" w:space="0" w:color="000000"/>
               <w:bottom w:val="single" w:sz="2" w:space="0" w:color="000000"/>
@@ -4511,7 +4511,7 @@
         </w:tc>
         <w:tc>
           <w:tcPr>
-            <w:tcW w:w="2214" w:type="dxa"/>
+            <w:tcW w:w="2215" w:type="dxa"/>
             <w:tcBorders>
               <w:left w:val="single" w:sz="2" w:space="0" w:color="000000"/>
               <w:bottom w:val="single" w:sz="2" w:space="0" w:color="000000"/>
@@ -4547,7 +4547,7 @@
         <w:trPr/>
         <w:tc>
           <w:tcPr>
-            <w:tcW w:w="1582" w:type="dxa"/>
+            <w:tcW w:w="1581" w:type="dxa"/>
             <w:tcBorders>
               <w:left w:val="single" w:sz="2" w:space="0" w:color="000000"/>
               <w:bottom w:val="single" w:sz="2" w:space="0" w:color="000000"/>
@@ -4599,7 +4599,7 @@
         </w:tc>
         <w:tc>
           <w:tcPr>
-            <w:tcW w:w="2214" w:type="dxa"/>
+            <w:tcW w:w="2215" w:type="dxa"/>
             <w:tcBorders>
               <w:left w:val="single" w:sz="2" w:space="0" w:color="000000"/>
               <w:bottom w:val="single" w:sz="2" w:space="0" w:color="000000"/>
@@ -4635,7 +4635,7 @@
         <w:trPr/>
         <w:tc>
           <w:tcPr>
-            <w:tcW w:w="1582" w:type="dxa"/>
+            <w:tcW w:w="1581" w:type="dxa"/>
             <w:tcBorders>
               <w:left w:val="single" w:sz="2" w:space="0" w:color="000000"/>
               <w:bottom w:val="single" w:sz="2" w:space="0" w:color="000000"/>
@@ -4695,7 +4695,7 @@
         </w:tc>
         <w:tc>
           <w:tcPr>
-            <w:tcW w:w="2214" w:type="dxa"/>
+            <w:tcW w:w="2215" w:type="dxa"/>
             <w:tcBorders>
               <w:left w:val="single" w:sz="2" w:space="0" w:color="000000"/>
               <w:bottom w:val="single" w:sz="2" w:space="0" w:color="000000"/>
@@ -4732,7 +4732,7 @@
         <w:trPr/>
         <w:tc>
           <w:tcPr>
-            <w:tcW w:w="1582" w:type="dxa"/>
+            <w:tcW w:w="1581" w:type="dxa"/>
             <w:tcBorders>
               <w:left w:val="single" w:sz="2" w:space="0" w:color="000000"/>
               <w:bottom w:val="single" w:sz="2" w:space="0" w:color="000000"/>
@@ -4743,16 +4743,13 @@
             <w:pPr>
               <w:pStyle w:val="Tabelindhold"/>
               <w:rPr>
+                <w:color w:val="C9211E"/>
+              </w:rPr>
+            </w:pPr>
+            <w:r>
+              <w:rPr>
                 <w:rFonts w:ascii="Verdana" w:hAnsi="Verdana"/>
-                <w:color w:val="000000"/>
-                <w:sz w:val="22"/>
-                <w:szCs w:val="22"/>
-              </w:rPr>
-            </w:pPr>
-            <w:r>
-              <w:rPr>
-                <w:rFonts w:ascii="Verdana" w:hAnsi="Verdana"/>
-                <w:color w:val="000000"/>
+                <w:color w:val="C9211E"/>
                 <w:sz w:val="22"/>
                 <w:szCs w:val="22"/>
               </w:rPr>
@@ -4773,26 +4770,41 @@
             <w:pPr>
               <w:pStyle w:val="Tabelindhold"/>
               <w:rPr>
+                <w:color w:val="C9211E"/>
+              </w:rPr>
+            </w:pPr>
+            <w:r>
+              <w:rPr>
                 <w:rFonts w:ascii="Verdana" w:hAnsi="Verdana"/>
-                <w:color w:val="000000"/>
+                <w:color w:val="C9211E"/>
                 <w:sz w:val="22"/>
                 <w:szCs w:val="22"/>
               </w:rPr>
-            </w:pPr>
+              <w:t xml:space="preserve">Settings for </w:t>
+            </w:r>
             <w:r>
               <w:rPr>
                 <w:rFonts w:ascii="Verdana" w:hAnsi="Verdana"/>
-                <w:color w:val="000000"/>
+                <w:color w:val="C9211E"/>
                 <w:sz w:val="22"/>
                 <w:szCs w:val="22"/>
               </w:rPr>
-              <w:t>Settings for universal Braille-device profile</w:t>
-            </w:r>
-          </w:p>
-        </w:tc>
-        <w:tc>
-          <w:tcPr>
-            <w:tcW w:w="2214" w:type="dxa"/>
+              <w:t xml:space="preserve">high speed </w:t>
+            </w:r>
+            <w:r>
+              <w:rPr>
+                <w:rFonts w:ascii="Verdana" w:hAnsi="Verdana"/>
+                <w:color w:val="C9211E"/>
+                <w:sz w:val="22"/>
+                <w:szCs w:val="22"/>
+              </w:rPr>
+              <w:t>embosser profile</w:t>
+            </w:r>
+          </w:p>
+        </w:tc>
+        <w:tc>
+          <w:tcPr>
+            <w:tcW w:w="2215" w:type="dxa"/>
             <w:tcBorders>
               <w:left w:val="single" w:sz="2" w:space="0" w:color="000000"/>
               <w:bottom w:val="single" w:sz="2" w:space="0" w:color="000000"/>
@@ -4805,22 +4817,28 @@
               <w:pStyle w:val="Tabelindhold"/>
               <w:snapToGrid w:val="false"/>
               <w:rPr>
-                <w:rFonts w:ascii="Verdana" w:hAnsi="Verdana" w:cs="Verdana"/>
-                <w:color w:val="000000"/>
+                <w:color w:val="C9211E"/>
+              </w:rPr>
+            </w:pPr>
+            <w:r>
+              <w:rPr>
+                <w:rFonts w:cs="Verdana" w:ascii="Verdana" w:hAnsi="Verdana"/>
+                <w:color w:val="C9211E"/>
                 <w:sz w:val="22"/>
                 <w:szCs w:val="22"/>
                 <w:lang w:val="en-US"/>
               </w:rPr>
-            </w:pPr>
-            <w:r>
-              <w:rPr>
-                <w:rFonts w:cs="Verdana" w:ascii="Verdana" w:hAnsi="Verdana"/>
-                <w:color w:val="000000"/>
+              <w:t xml:space="preserve">ALT + S + </w:t>
+            </w:r>
+            <w:r>
+              <w:rPr>
+                <w:rFonts w:cs="Verdana" w:ascii="Verdana" w:hAnsi="Verdana"/>
+                <w:color w:val="C9211E"/>
                 <w:sz w:val="22"/>
                 <w:szCs w:val="22"/>
                 <w:lang w:val="en-US"/>
               </w:rPr>
-              <w:t>ALT + S + U</w:t>
+              <w:t>H</w:t>
             </w:r>
           </w:p>
         </w:tc>
@@ -4829,7 +4847,7 @@
         <w:trPr/>
         <w:tc>
           <w:tcPr>
-            <w:tcW w:w="1582" w:type="dxa"/>
+            <w:tcW w:w="1581" w:type="dxa"/>
             <w:tcBorders>
               <w:left w:val="single" w:sz="2" w:space="0" w:color="000000"/>
               <w:bottom w:val="single" w:sz="2" w:space="0" w:color="000000"/>
@@ -4883,13 +4901,13 @@
                 <w:sz w:val="22"/>
                 <w:szCs w:val="22"/>
               </w:rPr>
-              <w:t>Reset all settings to default</w:t>
-            </w:r>
-          </w:p>
-        </w:tc>
-        <w:tc>
-          <w:tcPr>
-            <w:tcW w:w="2214" w:type="dxa"/>
+              <w:t>Settings for universal Braille-device profile</w:t>
+            </w:r>
+          </w:p>
+        </w:tc>
+        <w:tc>
+          <w:tcPr>
+            <w:tcW w:w="2215" w:type="dxa"/>
             <w:tcBorders>
               <w:left w:val="single" w:sz="2" w:space="0" w:color="000000"/>
               <w:bottom w:val="single" w:sz="2" w:space="0" w:color="000000"/>
@@ -4917,7 +4935,7 @@
                 <w:szCs w:val="22"/>
                 <w:lang w:val="en-US"/>
               </w:rPr>
-              <w:t>ALT + S + R</w:t>
+              <w:t>ALT + S + U</w:t>
             </w:r>
           </w:p>
         </w:tc>
@@ -4926,7 +4944,7 @@
         <w:trPr/>
         <w:tc>
           <w:tcPr>
-            <w:tcW w:w="1582" w:type="dxa"/>
+            <w:tcW w:w="1581" w:type="dxa"/>
             <w:tcBorders>
               <w:left w:val="single" w:sz="2" w:space="0" w:color="000000"/>
               <w:bottom w:val="single" w:sz="2" w:space="0" w:color="000000"/>
@@ -4937,16 +4955,20 @@
             <w:pPr>
               <w:pStyle w:val="Tabelindhold"/>
               <w:rPr>
-                <w:rFonts w:ascii="Verdana" w:hAnsi="Verdana" w:cs="Verdana"/>
-                <w:sz w:val="22"/>
-              </w:rPr>
-            </w:pPr>
-            <w:r>
-              <w:rPr>
-                <w:rFonts w:cs="Verdana" w:ascii="Verdana" w:hAnsi="Verdana"/>
-                <w:sz w:val="22"/>
-              </w:rPr>
-              <w:t>Tools</w:t>
+                <w:rFonts w:ascii="Verdana" w:hAnsi="Verdana"/>
+                <w:color w:val="000000"/>
+                <w:sz w:val="22"/>
+                <w:szCs w:val="22"/>
+              </w:rPr>
+            </w:pPr>
+            <w:r>
+              <w:rPr>
+                <w:rFonts w:ascii="Verdana" w:hAnsi="Verdana"/>
+                <w:color w:val="000000"/>
+                <w:sz w:val="22"/>
+                <w:szCs w:val="22"/>
+              </w:rPr>
+              <w:t>Settings</w:t>
             </w:r>
           </w:p>
         </w:tc>
@@ -4963,24 +4985,26 @@
             <w:pPr>
               <w:pStyle w:val="Tabelindhold"/>
               <w:rPr>
-                <w:rFonts w:ascii="Verdana" w:hAnsi="Verdana" w:cs="Verdana"/>
-                <w:sz w:val="22"/>
-                <w:lang w:val="en-US"/>
-              </w:rPr>
-            </w:pPr>
-            <w:r>
-              <w:rPr>
-                <w:rFonts w:cs="Verdana" w:ascii="Verdana" w:hAnsi="Verdana"/>
-                <w:sz w:val="22"/>
-                <w:lang w:val="en-US"/>
-              </w:rPr>
-              <w:t>Start MuseScore using current MusicXml file</w:t>
-            </w:r>
-          </w:p>
-        </w:tc>
-        <w:tc>
-          <w:tcPr>
-            <w:tcW w:w="2214" w:type="dxa"/>
+                <w:rFonts w:ascii="Verdana" w:hAnsi="Verdana"/>
+                <w:color w:val="000000"/>
+                <w:sz w:val="22"/>
+                <w:szCs w:val="22"/>
+              </w:rPr>
+            </w:pPr>
+            <w:r>
+              <w:rPr>
+                <w:rFonts w:ascii="Verdana" w:hAnsi="Verdana"/>
+                <w:color w:val="000000"/>
+                <w:sz w:val="22"/>
+                <w:szCs w:val="22"/>
+              </w:rPr>
+              <w:t>Reset all settings to default</w:t>
+            </w:r>
+          </w:p>
+        </w:tc>
+        <w:tc>
+          <w:tcPr>
+            <w:tcW w:w="2215" w:type="dxa"/>
             <w:tcBorders>
               <w:left w:val="single" w:sz="2" w:space="0" w:color="000000"/>
               <w:bottom w:val="single" w:sz="2" w:space="0" w:color="000000"/>
@@ -4994,18 +5018,21 @@
               <w:snapToGrid w:val="false"/>
               <w:rPr>
                 <w:rFonts w:ascii="Verdana" w:hAnsi="Verdana" w:cs="Verdana"/>
-                <w:sz w:val="22"/>
+                <w:color w:val="000000"/>
+                <w:sz w:val="22"/>
+                <w:szCs w:val="22"/>
                 <w:lang w:val="en-US"/>
               </w:rPr>
             </w:pPr>
             <w:r>
               <w:rPr>
                 <w:rFonts w:cs="Verdana" w:ascii="Verdana" w:hAnsi="Verdana"/>
-                <w:color w:val="C9211E"/>
-                <w:sz w:val="22"/>
+                <w:color w:val="000000"/>
+                <w:sz w:val="22"/>
+                <w:szCs w:val="22"/>
                 <w:lang w:val="en-US"/>
               </w:rPr>
-              <w:t>ALT + T + M</w:t>
+              <w:t>ALT + S + R</w:t>
             </w:r>
           </w:p>
         </w:tc>
@@ -5014,7 +5041,7 @@
         <w:trPr/>
         <w:tc>
           <w:tcPr>
-            <w:tcW w:w="1582" w:type="dxa"/>
+            <w:tcW w:w="1581" w:type="dxa"/>
             <w:tcBorders>
               <w:left w:val="single" w:sz="2" w:space="0" w:color="000000"/>
               <w:bottom w:val="single" w:sz="2" w:space="0" w:color="000000"/>
@@ -5025,14 +5052,13 @@
             <w:pPr>
               <w:pStyle w:val="Tabelindhold"/>
               <w:rPr>
-                <w:rFonts w:ascii="Verdana" w:hAnsi="Verdana" w:cs="Verdana"/>
-                <w:sz w:val="22"/>
-                <w:lang w:val="da-DK"/>
-              </w:rPr>
-            </w:pPr>
-            <w:r>
-              <w:rPr>
-                <w:rFonts w:cs="Verdana" w:ascii="Verdana" w:hAnsi="Verdana"/>
+                <w:color w:val="C9211E"/>
+              </w:rPr>
+            </w:pPr>
+            <w:r>
+              <w:rPr>
+                <w:rFonts w:cs="Verdana" w:ascii="Verdana" w:hAnsi="Verdana"/>
+                <w:color w:val="C9211E"/>
                 <w:sz w:val="22"/>
               </w:rPr>
               <w:t>Tools</w:t>
@@ -5052,24 +5078,32 @@
             <w:pPr>
               <w:pStyle w:val="Tabelindhold"/>
               <w:rPr>
-                <w:rFonts w:ascii="Verdana" w:hAnsi="Verdana" w:cs="Verdana"/>
+                <w:color w:val="C9211E"/>
+              </w:rPr>
+            </w:pPr>
+            <w:r>
+              <w:rPr>
+                <w:rFonts w:cs="Verdana" w:ascii="Verdana" w:hAnsi="Verdana"/>
+                <w:color w:val="C9211E"/>
                 <w:sz w:val="22"/>
                 <w:lang w:val="en-US"/>
               </w:rPr>
-            </w:pPr>
-            <w:r>
-              <w:rPr>
-                <w:rFonts w:cs="Verdana" w:ascii="Verdana" w:hAnsi="Verdana"/>
+              <w:t xml:space="preserve">Start </w:t>
+            </w:r>
+            <w:r>
+              <w:rPr>
+                <w:rFonts w:cs="Verdana" w:ascii="Verdana" w:hAnsi="Verdana"/>
+                <w:color w:val="C9211E"/>
                 <w:sz w:val="22"/>
                 <w:lang w:val="en-US"/>
               </w:rPr>
-              <w:t>Start Sibelius using current MusicXml file</w:t>
-            </w:r>
-          </w:p>
-        </w:tc>
-        <w:tc>
-          <w:tcPr>
-            <w:tcW w:w="2214" w:type="dxa"/>
+              <w:t>IBOS Music Braille Reader</w:t>
+            </w:r>
+          </w:p>
+        </w:tc>
+        <w:tc>
+          <w:tcPr>
+            <w:tcW w:w="2215" w:type="dxa"/>
             <w:tcBorders>
               <w:left w:val="single" w:sz="2" w:space="0" w:color="000000"/>
               <w:bottom w:val="single" w:sz="2" w:space="0" w:color="000000"/>
@@ -5082,11 +5116,18 @@
               <w:pStyle w:val="Tabelindhold"/>
               <w:snapToGrid w:val="false"/>
               <w:rPr>
-                <w:rFonts w:ascii="Verdana" w:hAnsi="Verdana" w:cs="Verdana"/>
+                <w:color w:val="C9211E"/>
+              </w:rPr>
+            </w:pPr>
+            <w:r>
+              <w:rPr>
+                <w:rFonts w:cs="Verdana" w:ascii="Verdana" w:hAnsi="Verdana"/>
+                <w:color w:val="C9211E"/>
                 <w:sz w:val="22"/>
                 <w:lang w:val="en-US"/>
               </w:rPr>
-            </w:pPr>
+              <w:t xml:space="preserve">ALT + T + </w:t>
+            </w:r>
             <w:r>
               <w:rPr>
                 <w:rFonts w:cs="Verdana" w:ascii="Verdana" w:hAnsi="Verdana"/>
@@ -5094,7 +5135,7 @@
                 <w:sz w:val="22"/>
                 <w:lang w:val="en-US"/>
               </w:rPr>
-              <w:t>ALT + T + S</w:t>
+              <w:t>I</w:t>
             </w:r>
           </w:p>
         </w:tc>
@@ -5103,7 +5144,7 @@
         <w:trPr/>
         <w:tc>
           <w:tcPr>
-            <w:tcW w:w="1582" w:type="dxa"/>
+            <w:tcW w:w="1581" w:type="dxa"/>
             <w:tcBorders>
               <w:left w:val="single" w:sz="2" w:space="0" w:color="000000"/>
               <w:bottom w:val="single" w:sz="2" w:space="0" w:color="000000"/>
@@ -5113,10 +5154,16 @@
           <w:p>
             <w:pPr>
               <w:pStyle w:val="Tabelindhold"/>
-              <w:rPr/>
-            </w:pPr>
-            <w:r>
-              <w:rPr/>
+              <w:rPr>
+                <w:rFonts w:ascii="Verdana" w:hAnsi="Verdana" w:cs="Verdana"/>
+                <w:sz w:val="22"/>
+              </w:rPr>
+            </w:pPr>
+            <w:r>
+              <w:rPr>
+                <w:rFonts w:cs="Verdana" w:ascii="Verdana" w:hAnsi="Verdana"/>
+                <w:sz w:val="22"/>
+              </w:rPr>
               <w:t>Tools</w:t>
             </w:r>
           </w:p>
@@ -5133,21 +5180,25 @@
           <w:p>
             <w:pPr>
               <w:pStyle w:val="Tabelindhold"/>
-              <w:rPr/>
-            </w:pPr>
-            <w:r>
-              <w:rPr>
-                <w:rFonts w:cs="Verdana" w:ascii="Verdana" w:hAnsi="Verdana"/>
+              <w:rPr>
+                <w:rFonts w:ascii="Verdana" w:hAnsi="Verdana" w:cs="Verdana"/>
                 <w:sz w:val="22"/>
                 <w:lang w:val="en-US"/>
               </w:rPr>
-              <w:t>Start Capella using current MusicXml file</w:t>
-            </w:r>
-          </w:p>
-        </w:tc>
-        <w:tc>
-          <w:tcPr>
-            <w:tcW w:w="2214" w:type="dxa"/>
+            </w:pPr>
+            <w:r>
+              <w:rPr>
+                <w:rFonts w:cs="Verdana" w:ascii="Verdana" w:hAnsi="Verdana"/>
+                <w:sz w:val="22"/>
+                <w:lang w:val="en-US"/>
+              </w:rPr>
+              <w:t>Start MuseScore using current MusicXml file</w:t>
+            </w:r>
+          </w:p>
+        </w:tc>
+        <w:tc>
+          <w:tcPr>
+            <w:tcW w:w="2215" w:type="dxa"/>
             <w:tcBorders>
               <w:left w:val="single" w:sz="2" w:space="0" w:color="000000"/>
               <w:bottom w:val="single" w:sz="2" w:space="0" w:color="000000"/>
@@ -5168,11 +5219,11 @@
             <w:r>
               <w:rPr>
                 <w:rFonts w:cs="Verdana" w:ascii="Verdana" w:hAnsi="Verdana"/>
-                <w:color w:val="C9211E"/>
+                <w:color w:val="000000"/>
                 <w:sz w:val="22"/>
                 <w:lang w:val="en-US"/>
               </w:rPr>
-              <w:t>ALT + T + C</w:t>
+              <w:t>ALT + T + M</w:t>
             </w:r>
           </w:p>
         </w:tc>
@@ -5181,7 +5232,7 @@
         <w:trPr/>
         <w:tc>
           <w:tcPr>
-            <w:tcW w:w="1582" w:type="dxa"/>
+            <w:tcW w:w="1581" w:type="dxa"/>
             <w:tcBorders>
               <w:left w:val="single" w:sz="2" w:space="0" w:color="000000"/>
               <w:bottom w:val="single" w:sz="2" w:space="0" w:color="000000"/>
@@ -5191,10 +5242,17 @@
           <w:p>
             <w:pPr>
               <w:pStyle w:val="Tabelindhold"/>
-              <w:rPr/>
-            </w:pPr>
-            <w:r>
-              <w:rPr/>
+              <w:rPr>
+                <w:rFonts w:ascii="Verdana" w:hAnsi="Verdana" w:cs="Verdana"/>
+                <w:sz w:val="22"/>
+                <w:lang w:val="da-DK"/>
+              </w:rPr>
+            </w:pPr>
+            <w:r>
+              <w:rPr>
+                <w:rFonts w:cs="Verdana" w:ascii="Verdana" w:hAnsi="Verdana"/>
+                <w:sz w:val="22"/>
+              </w:rPr>
               <w:t>Tools</w:t>
             </w:r>
           </w:p>
@@ -5211,21 +5269,25 @@
           <w:p>
             <w:pPr>
               <w:pStyle w:val="Tabelindhold"/>
-              <w:rPr/>
-            </w:pPr>
-            <w:r>
-              <w:rPr>
-                <w:rFonts w:cs="Verdana" w:ascii="Verdana" w:hAnsi="Verdana"/>
+              <w:rPr>
+                <w:rFonts w:ascii="Verdana" w:hAnsi="Verdana" w:cs="Verdana"/>
                 <w:sz w:val="22"/>
                 <w:lang w:val="en-US"/>
               </w:rPr>
-              <w:t>Start Finale using current MusicXml file</w:t>
-            </w:r>
-          </w:p>
-        </w:tc>
-        <w:tc>
-          <w:tcPr>
-            <w:tcW w:w="2214" w:type="dxa"/>
+            </w:pPr>
+            <w:r>
+              <w:rPr>
+                <w:rFonts w:cs="Verdana" w:ascii="Verdana" w:hAnsi="Verdana"/>
+                <w:sz w:val="22"/>
+                <w:lang w:val="en-US"/>
+              </w:rPr>
+              <w:t>Start Sibelius using current MusicXml file</w:t>
+            </w:r>
+          </w:p>
+        </w:tc>
+        <w:tc>
+          <w:tcPr>
+            <w:tcW w:w="2215" w:type="dxa"/>
             <w:tcBorders>
               <w:left w:val="single" w:sz="2" w:space="0" w:color="000000"/>
               <w:bottom w:val="single" w:sz="2" w:space="0" w:color="000000"/>
@@ -5246,11 +5308,11 @@
             <w:r>
               <w:rPr>
                 <w:rFonts w:cs="Verdana" w:ascii="Verdana" w:hAnsi="Verdana"/>
-                <w:color w:val="C9211E"/>
+                <w:color w:val="000000"/>
                 <w:sz w:val="22"/>
                 <w:lang w:val="en-US"/>
               </w:rPr>
-              <w:t>ALT + T + F</w:t>
+              <w:t>ALT + T + S</w:t>
             </w:r>
           </w:p>
         </w:tc>
@@ -5259,7 +5321,7 @@
         <w:trPr/>
         <w:tc>
           <w:tcPr>
-            <w:tcW w:w="1582" w:type="dxa"/>
+            <w:tcW w:w="1581" w:type="dxa"/>
             <w:tcBorders>
               <w:left w:val="single" w:sz="2" w:space="0" w:color="000000"/>
               <w:bottom w:val="single" w:sz="2" w:space="0" w:color="000000"/>
@@ -5269,16 +5331,10 @@
           <w:p>
             <w:pPr>
               <w:pStyle w:val="Tabelindhold"/>
-              <w:rPr>
-                <w:rFonts w:ascii="Verdana" w:hAnsi="Verdana" w:cs="Verdana"/>
-                <w:sz w:val="22"/>
-              </w:rPr>
-            </w:pPr>
-            <w:r>
-              <w:rPr>
-                <w:rFonts w:cs="Verdana" w:ascii="Verdana" w:hAnsi="Verdana"/>
-                <w:sz w:val="22"/>
-              </w:rPr>
+              <w:rPr/>
+            </w:pPr>
+            <w:r>
+              <w:rPr/>
               <w:t>Tools</w:t>
             </w:r>
           </w:p>
@@ -5301,14 +5357,15 @@
               <w:rPr>
                 <w:rFonts w:cs="Verdana" w:ascii="Verdana" w:hAnsi="Verdana"/>
                 <w:sz w:val="22"/>
-              </w:rPr>
-              <w:t>Log file</w:t>
-            </w:r>
-          </w:p>
-        </w:tc>
-        <w:tc>
-          <w:tcPr>
-            <w:tcW w:w="2214" w:type="dxa"/>
+                <w:lang w:val="en-US"/>
+              </w:rPr>
+              <w:t>Start Capella using current MusicXml file</w:t>
+            </w:r>
+          </w:p>
+        </w:tc>
+        <w:tc>
+          <w:tcPr>
+            <w:tcW w:w="2215" w:type="dxa"/>
             <w:tcBorders>
               <w:left w:val="single" w:sz="2" w:space="0" w:color="000000"/>
               <w:bottom w:val="single" w:sz="2" w:space="0" w:color="000000"/>
@@ -5323,13 +5380,17 @@
               <w:rPr>
                 <w:rFonts w:ascii="Verdana" w:hAnsi="Verdana" w:cs="Verdana"/>
                 <w:sz w:val="22"/>
-              </w:rPr>
-            </w:pPr>
-            <w:r>
-              <w:rPr>
-                <w:rFonts w:cs="Verdana" w:ascii="Verdana" w:hAnsi="Verdana"/>
-                <w:sz w:val="22"/>
-              </w:rPr>
+                <w:lang w:val="en-US"/>
+              </w:rPr>
+            </w:pPr>
+            <w:r>
+              <w:rPr>
+                <w:rFonts w:cs="Verdana" w:ascii="Verdana" w:hAnsi="Verdana"/>
+                <w:color w:val="000000"/>
+                <w:sz w:val="22"/>
+                <w:lang w:val="en-US"/>
+              </w:rPr>
+              <w:t>ALT + T + C</w:t>
             </w:r>
           </w:p>
         </w:tc>
@@ -5338,7 +5399,7 @@
         <w:trPr/>
         <w:tc>
           <w:tcPr>
-            <w:tcW w:w="1582" w:type="dxa"/>
+            <w:tcW w:w="1581" w:type="dxa"/>
             <w:tcBorders>
               <w:left w:val="single" w:sz="2" w:space="0" w:color="000000"/>
               <w:bottom w:val="single" w:sz="2" w:space="0" w:color="000000"/>
@@ -5348,16 +5409,10 @@
           <w:p>
             <w:pPr>
               <w:pStyle w:val="Tabelindhold"/>
-              <w:rPr>
-                <w:rFonts w:ascii="Verdana" w:hAnsi="Verdana" w:cs="Verdana"/>
-                <w:sz w:val="22"/>
-              </w:rPr>
-            </w:pPr>
-            <w:r>
-              <w:rPr>
-                <w:rFonts w:cs="Verdana" w:ascii="Verdana" w:hAnsi="Verdana"/>
-                <w:sz w:val="22"/>
-              </w:rPr>
+              <w:rPr/>
+            </w:pPr>
+            <w:r>
+              <w:rPr/>
               <w:t>Tools</w:t>
             </w:r>
           </w:p>
@@ -5382,13 +5437,13 @@
                 <w:sz w:val="22"/>
                 <w:lang w:val="en-US"/>
               </w:rPr>
-              <w:t>Log file path in Windows Explorer</w:t>
-            </w:r>
-          </w:p>
-        </w:tc>
-        <w:tc>
-          <w:tcPr>
-            <w:tcW w:w="2214" w:type="dxa"/>
+              <w:t>Start Finale using current MusicXml file</w:t>
+            </w:r>
+          </w:p>
+        </w:tc>
+        <w:tc>
+          <w:tcPr>
+            <w:tcW w:w="2215" w:type="dxa"/>
             <w:tcBorders>
               <w:left w:val="single" w:sz="2" w:space="0" w:color="000000"/>
               <w:bottom w:val="single" w:sz="2" w:space="0" w:color="000000"/>
@@ -5409,9 +5464,11 @@
             <w:r>
               <w:rPr>
                 <w:rFonts w:cs="Verdana" w:ascii="Verdana" w:hAnsi="Verdana"/>
+                <w:color w:val="000000"/>
                 <w:sz w:val="22"/>
                 <w:lang w:val="en-US"/>
               </w:rPr>
+              <w:t>ALT + T + F</w:t>
             </w:r>
           </w:p>
         </w:tc>
@@ -5420,7 +5477,7 @@
         <w:trPr/>
         <w:tc>
           <w:tcPr>
-            <w:tcW w:w="1582" w:type="dxa"/>
+            <w:tcW w:w="1581" w:type="dxa"/>
             <w:tcBorders>
               <w:left w:val="single" w:sz="2" w:space="0" w:color="000000"/>
               <w:bottom w:val="single" w:sz="2" w:space="0" w:color="000000"/>
@@ -5432,6 +5489,7 @@
               <w:pStyle w:val="Tabelindhold"/>
               <w:rPr>
                 <w:rFonts w:ascii="Verdana" w:hAnsi="Verdana"/>
+                <w:color w:val="C9211E"/>
                 <w:sz w:val="22"/>
                 <w:szCs w:val="22"/>
               </w:rPr>
@@ -5439,6 +5497,7 @@
             <w:r>
               <w:rPr>
                 <w:rFonts w:ascii="Verdana" w:hAnsi="Verdana"/>
+                <w:color w:val="C9211E"/>
                 <w:sz w:val="22"/>
                 <w:szCs w:val="22"/>
               </w:rPr>
@@ -5460,6 +5519,7 @@
               <w:pStyle w:val="Tabelindhold"/>
               <w:rPr>
                 <w:rFonts w:ascii="Verdana" w:hAnsi="Verdana"/>
+                <w:color w:val="C9211E"/>
                 <w:sz w:val="22"/>
                 <w:szCs w:val="22"/>
               </w:rPr>
@@ -5467,16 +5527,17 @@
             <w:r>
               <w:rPr>
                 <w:rFonts w:ascii="Verdana" w:hAnsi="Verdana"/>
+                <w:color w:val="C9211E"/>
                 <w:sz w:val="22"/>
                 <w:szCs w:val="22"/>
               </w:rPr>
-              <w:t>MusicXml file path</w:t>
-            </w:r>
-          </w:p>
-        </w:tc>
-        <w:tc>
-          <w:tcPr>
-            <w:tcW w:w="2214" w:type="dxa"/>
+              <w:t>Start PhotoScore</w:t>
+            </w:r>
+          </w:p>
+        </w:tc>
+        <w:tc>
+          <w:tcPr>
+            <w:tcW w:w="2215" w:type="dxa"/>
             <w:tcBorders>
               <w:left w:val="single" w:sz="2" w:space="0" w:color="000000"/>
               <w:bottom w:val="single" w:sz="2" w:space="0" w:color="000000"/>
@@ -5490,16 +5551,19 @@
               <w:snapToGrid w:val="false"/>
               <w:rPr>
                 <w:rFonts w:ascii="Verdana" w:hAnsi="Verdana" w:cs="Verdana"/>
-                <w:sz w:val="22"/>
-                <w:lang w:val="en-US"/>
-              </w:rPr>
-            </w:pPr>
-            <w:r>
-              <w:rPr>
-                <w:rFonts w:cs="Verdana" w:ascii="Verdana" w:hAnsi="Verdana"/>
-                <w:sz w:val="22"/>
-                <w:lang w:val="en-US"/>
-              </w:rPr>
+                <w:color w:val="C9211E"/>
+                <w:sz w:val="22"/>
+                <w:szCs w:val="22"/>
+              </w:rPr>
+            </w:pPr>
+            <w:r>
+              <w:rPr>
+                <w:rFonts w:cs="Verdana" w:ascii="Verdana" w:hAnsi="Verdana"/>
+                <w:color w:val="C9211E"/>
+                <w:sz w:val="22"/>
+                <w:szCs w:val="22"/>
+              </w:rPr>
+              <w:t>ALT + T + P</w:t>
             </w:r>
           </w:p>
         </w:tc>
@@ -5508,7 +5572,7 @@
         <w:trPr/>
         <w:tc>
           <w:tcPr>
-            <w:tcW w:w="1582" w:type="dxa"/>
+            <w:tcW w:w="1581" w:type="dxa"/>
             <w:tcBorders>
               <w:left w:val="single" w:sz="2" w:space="0" w:color="000000"/>
               <w:bottom w:val="single" w:sz="2" w:space="0" w:color="000000"/>
@@ -5519,14 +5583,18 @@
             <w:pPr>
               <w:pStyle w:val="Tabelindhold"/>
               <w:rPr>
-                <w:rFonts w:ascii="Verdana" w:hAnsi="Verdana" w:cs="Verdana"/>
-                <w:sz w:val="22"/>
-              </w:rPr>
-            </w:pPr>
-            <w:r>
-              <w:rPr>
-                <w:rFonts w:cs="Verdana" w:ascii="Verdana" w:hAnsi="Verdana"/>
-                <w:sz w:val="22"/>
+                <w:rFonts w:ascii="Verdana" w:hAnsi="Verdana"/>
+                <w:color w:val="C9211E"/>
+                <w:sz w:val="22"/>
+                <w:szCs w:val="22"/>
+              </w:rPr>
+            </w:pPr>
+            <w:r>
+              <w:rPr>
+                <w:rFonts w:ascii="Verdana" w:hAnsi="Verdana"/>
+                <w:color w:val="C9211E"/>
+                <w:sz w:val="22"/>
+                <w:szCs w:val="22"/>
               </w:rPr>
               <w:t>Tools</w:t>
             </w:r>
@@ -5544,21 +5612,27 @@
           <w:p>
             <w:pPr>
               <w:pStyle w:val="Tabelindhold"/>
-              <w:rPr/>
-            </w:pPr>
-            <w:r>
-              <w:rPr>
-                <w:rFonts w:cs="Verdana" w:ascii="Verdana" w:hAnsi="Verdana"/>
-                <w:sz w:val="22"/>
-                <w:lang w:val="en-US"/>
-              </w:rPr>
-              <w:t>Open current MusicXml file as raw XML</w:t>
-            </w:r>
-          </w:p>
-        </w:tc>
-        <w:tc>
-          <w:tcPr>
-            <w:tcW w:w="2214" w:type="dxa"/>
+              <w:rPr>
+                <w:rFonts w:ascii="Verdana" w:hAnsi="Verdana"/>
+                <w:color w:val="C9211E"/>
+                <w:sz w:val="22"/>
+                <w:szCs w:val="22"/>
+              </w:rPr>
+            </w:pPr>
+            <w:r>
+              <w:rPr>
+                <w:rFonts w:ascii="Verdana" w:hAnsi="Verdana"/>
+                <w:color w:val="C9211E"/>
+                <w:sz w:val="22"/>
+                <w:szCs w:val="22"/>
+              </w:rPr>
+              <w:t>Start Music Braille Editor 2</w:t>
+            </w:r>
+          </w:p>
+        </w:tc>
+        <w:tc>
+          <w:tcPr>
+            <w:tcW w:w="2215" w:type="dxa"/>
             <w:tcBorders>
               <w:left w:val="single" w:sz="2" w:space="0" w:color="000000"/>
               <w:bottom w:val="single" w:sz="2" w:space="0" w:color="000000"/>
@@ -5572,16 +5646,19 @@
               <w:snapToGrid w:val="false"/>
               <w:rPr>
                 <w:rFonts w:ascii="Verdana" w:hAnsi="Verdana" w:cs="Verdana"/>
-                <w:sz w:val="22"/>
-                <w:lang w:val="en-US"/>
-              </w:rPr>
-            </w:pPr>
-            <w:r>
-              <w:rPr>
-                <w:rFonts w:cs="Verdana" w:ascii="Verdana" w:hAnsi="Verdana"/>
-                <w:sz w:val="22"/>
-                <w:lang w:val="en-US"/>
-              </w:rPr>
+                <w:color w:val="C9211E"/>
+                <w:sz w:val="22"/>
+                <w:szCs w:val="22"/>
+              </w:rPr>
+            </w:pPr>
+            <w:r>
+              <w:rPr>
+                <w:rFonts w:cs="Verdana" w:ascii="Verdana" w:hAnsi="Verdana"/>
+                <w:color w:val="C9211E"/>
+                <w:sz w:val="22"/>
+                <w:szCs w:val="22"/>
+              </w:rPr>
+              <w:t>ALT + T + E</w:t>
             </w:r>
           </w:p>
         </w:tc>
@@ -5590,7 +5667,7 @@
         <w:trPr/>
         <w:tc>
           <w:tcPr>
-            <w:tcW w:w="1582" w:type="dxa"/>
+            <w:tcW w:w="1581" w:type="dxa"/>
             <w:tcBorders>
               <w:left w:val="single" w:sz="2" w:space="0" w:color="000000"/>
               <w:bottom w:val="single" w:sz="2" w:space="0" w:color="000000"/>
@@ -5632,15 +5709,14 @@
               <w:rPr>
                 <w:rFonts w:cs="Verdana" w:ascii="Verdana" w:hAnsi="Verdana"/>
                 <w:sz w:val="22"/>
-                <w:lang w:val="en-US"/>
-              </w:rPr>
-              <w:t>Open current MusicXml file as raw XML using Google Chrome</w:t>
-            </w:r>
-          </w:p>
-        </w:tc>
-        <w:tc>
-          <w:tcPr>
-            <w:tcW w:w="2214" w:type="dxa"/>
+              </w:rPr>
+              <w:t>Log file</w:t>
+            </w:r>
+          </w:p>
+        </w:tc>
+        <w:tc>
+          <w:tcPr>
+            <w:tcW w:w="2215" w:type="dxa"/>
             <w:tcBorders>
               <w:left w:val="single" w:sz="2" w:space="0" w:color="000000"/>
               <w:bottom w:val="single" w:sz="2" w:space="0" w:color="000000"/>
@@ -5654,16 +5730,17 @@
               <w:snapToGrid w:val="false"/>
               <w:rPr>
                 <w:rFonts w:ascii="Verdana" w:hAnsi="Verdana" w:cs="Verdana"/>
-                <w:sz w:val="22"/>
-                <w:lang w:val="en-US"/>
-              </w:rPr>
-            </w:pPr>
-            <w:r>
-              <w:rPr>
-                <w:rFonts w:cs="Verdana" w:ascii="Verdana" w:hAnsi="Verdana"/>
-                <w:sz w:val="22"/>
-                <w:lang w:val="en-US"/>
-              </w:rPr>
+                <w:color w:val="C9211E"/>
+                <w:sz w:val="22"/>
+              </w:rPr>
+            </w:pPr>
+            <w:r>
+              <w:rPr>
+                <w:rFonts w:cs="Verdana" w:ascii="Verdana" w:hAnsi="Verdana"/>
+                <w:color w:val="C9211E"/>
+                <w:sz w:val="22"/>
+              </w:rPr>
+              <w:t>ALT + T + L</w:t>
             </w:r>
           </w:p>
         </w:tc>
@@ -5672,7 +5749,7 @@
         <w:trPr/>
         <w:tc>
           <w:tcPr>
-            <w:tcW w:w="1582" w:type="dxa"/>
+            <w:tcW w:w="1581" w:type="dxa"/>
             <w:tcBorders>
               <w:left w:val="single" w:sz="2" w:space="0" w:color="000000"/>
               <w:bottom w:val="single" w:sz="2" w:space="0" w:color="000000"/>
@@ -5716,13 +5793,13 @@
                 <w:sz w:val="22"/>
                 <w:lang w:val="en-US"/>
               </w:rPr>
-              <w:t>Open JAWS settings for IBOS MusicXmlReader</w:t>
-            </w:r>
-          </w:p>
-        </w:tc>
-        <w:tc>
-          <w:tcPr>
-            <w:tcW w:w="2214" w:type="dxa"/>
+              <w:t>Log file path in Windows Explorer</w:t>
+            </w:r>
+          </w:p>
+        </w:tc>
+        <w:tc>
+          <w:tcPr>
+            <w:tcW w:w="2215" w:type="dxa"/>
             <w:tcBorders>
               <w:left w:val="single" w:sz="2" w:space="0" w:color="000000"/>
               <w:bottom w:val="single" w:sz="2" w:space="0" w:color="000000"/>
@@ -5754,7 +5831,7 @@
         <w:trPr/>
         <w:tc>
           <w:tcPr>
-            <w:tcW w:w="1582" w:type="dxa"/>
+            <w:tcW w:w="1581" w:type="dxa"/>
             <w:tcBorders>
               <w:left w:val="single" w:sz="2" w:space="0" w:color="000000"/>
               <w:bottom w:val="single" w:sz="2" w:space="0" w:color="000000"/>
@@ -5765,14 +5842,16 @@
             <w:pPr>
               <w:pStyle w:val="Tabelindhold"/>
               <w:rPr>
-                <w:rFonts w:ascii="Verdana" w:hAnsi="Verdana" w:cs="Verdana"/>
-                <w:sz w:val="22"/>
-              </w:rPr>
-            </w:pPr>
-            <w:r>
-              <w:rPr>
-                <w:rFonts w:cs="Verdana" w:ascii="Verdana" w:hAnsi="Verdana"/>
-                <w:sz w:val="22"/>
+                <w:rFonts w:ascii="Verdana" w:hAnsi="Verdana"/>
+                <w:sz w:val="22"/>
+                <w:szCs w:val="22"/>
+              </w:rPr>
+            </w:pPr>
+            <w:r>
+              <w:rPr>
+                <w:rFonts w:ascii="Verdana" w:hAnsi="Verdana"/>
+                <w:sz w:val="22"/>
+                <w:szCs w:val="22"/>
               </w:rPr>
               <w:t>Tools</w:t>
             </w:r>
@@ -5791,24 +5870,24 @@
             <w:pPr>
               <w:pStyle w:val="Tabelindhold"/>
               <w:rPr>
-                <w:rFonts w:ascii="Verdana" w:hAnsi="Verdana" w:cs="Verdana"/>
-                <w:sz w:val="22"/>
-                <w:lang w:val="en-US"/>
-              </w:rPr>
-            </w:pPr>
-            <w:r>
-              <w:rPr>
-                <w:rFonts w:cs="Verdana" w:ascii="Verdana" w:hAnsi="Verdana"/>
-                <w:sz w:val="22"/>
-                <w:lang w:val="en-US"/>
-              </w:rPr>
-              <w:t>Open user settings as raw XML</w:t>
-            </w:r>
-          </w:p>
-        </w:tc>
-        <w:tc>
-          <w:tcPr>
-            <w:tcW w:w="2214" w:type="dxa"/>
+                <w:rFonts w:ascii="Verdana" w:hAnsi="Verdana"/>
+                <w:sz w:val="22"/>
+                <w:szCs w:val="22"/>
+              </w:rPr>
+            </w:pPr>
+            <w:r>
+              <w:rPr>
+                <w:rFonts w:ascii="Verdana" w:hAnsi="Verdana"/>
+                <w:sz w:val="22"/>
+                <w:szCs w:val="22"/>
+              </w:rPr>
+              <w:t>MusicXml file path</w:t>
+            </w:r>
+          </w:p>
+        </w:tc>
+        <w:tc>
+          <w:tcPr>
+            <w:tcW w:w="2215" w:type="dxa"/>
             <w:tcBorders>
               <w:left w:val="single" w:sz="2" w:space="0" w:color="000000"/>
               <w:bottom w:val="single" w:sz="2" w:space="0" w:color="000000"/>
@@ -5840,7 +5919,351 @@
         <w:trPr/>
         <w:tc>
           <w:tcPr>
-            <w:tcW w:w="1582" w:type="dxa"/>
+            <w:tcW w:w="1581" w:type="dxa"/>
+            <w:tcBorders>
+              <w:left w:val="single" w:sz="2" w:space="0" w:color="000000"/>
+              <w:bottom w:val="single" w:sz="2" w:space="0" w:color="000000"/>
+            </w:tcBorders>
+            <w:shd w:fill="auto" w:val="clear"/>
+          </w:tcPr>
+          <w:p>
+            <w:pPr>
+              <w:pStyle w:val="Tabelindhold"/>
+              <w:rPr>
+                <w:rFonts w:ascii="Verdana" w:hAnsi="Verdana" w:cs="Verdana"/>
+                <w:sz w:val="22"/>
+              </w:rPr>
+            </w:pPr>
+            <w:r>
+              <w:rPr>
+                <w:rFonts w:cs="Verdana" w:ascii="Verdana" w:hAnsi="Verdana"/>
+                <w:sz w:val="22"/>
+              </w:rPr>
+              <w:t>Tools</w:t>
+            </w:r>
+          </w:p>
+        </w:tc>
+        <w:tc>
+          <w:tcPr>
+            <w:tcW w:w="5219" w:type="dxa"/>
+            <w:tcBorders>
+              <w:left w:val="single" w:sz="2" w:space="0" w:color="000000"/>
+              <w:bottom w:val="single" w:sz="2" w:space="0" w:color="000000"/>
+            </w:tcBorders>
+            <w:shd w:fill="auto" w:val="clear"/>
+          </w:tcPr>
+          <w:p>
+            <w:pPr>
+              <w:pStyle w:val="Tabelindhold"/>
+              <w:rPr/>
+            </w:pPr>
+            <w:r>
+              <w:rPr>
+                <w:rFonts w:cs="Verdana" w:ascii="Verdana" w:hAnsi="Verdana"/>
+                <w:sz w:val="22"/>
+                <w:lang w:val="en-US"/>
+              </w:rPr>
+              <w:t>Open current MusicXml file as raw XML</w:t>
+            </w:r>
+          </w:p>
+        </w:tc>
+        <w:tc>
+          <w:tcPr>
+            <w:tcW w:w="2215" w:type="dxa"/>
+            <w:tcBorders>
+              <w:left w:val="single" w:sz="2" w:space="0" w:color="000000"/>
+              <w:bottom w:val="single" w:sz="2" w:space="0" w:color="000000"/>
+              <w:right w:val="single" w:sz="2" w:space="0" w:color="000000"/>
+            </w:tcBorders>
+            <w:shd w:fill="auto" w:val="clear"/>
+          </w:tcPr>
+          <w:p>
+            <w:pPr>
+              <w:pStyle w:val="Tabelindhold"/>
+              <w:snapToGrid w:val="false"/>
+              <w:rPr>
+                <w:rFonts w:ascii="Verdana" w:hAnsi="Verdana" w:cs="Verdana"/>
+                <w:color w:val="C9211E"/>
+                <w:sz w:val="22"/>
+                <w:lang w:val="en-US"/>
+              </w:rPr>
+            </w:pPr>
+            <w:r>
+              <w:rPr>
+                <w:rFonts w:cs="Verdana" w:ascii="Verdana" w:hAnsi="Verdana"/>
+                <w:color w:val="C9211E"/>
+                <w:sz w:val="22"/>
+                <w:lang w:val="en-US"/>
+              </w:rPr>
+              <w:t>ALT + T + X</w:t>
+            </w:r>
+          </w:p>
+        </w:tc>
+      </w:tr>
+      <w:tr>
+        <w:trPr/>
+        <w:tc>
+          <w:tcPr>
+            <w:tcW w:w="1581" w:type="dxa"/>
+            <w:tcBorders>
+              <w:left w:val="single" w:sz="2" w:space="0" w:color="000000"/>
+              <w:bottom w:val="single" w:sz="2" w:space="0" w:color="000000"/>
+            </w:tcBorders>
+            <w:shd w:fill="auto" w:val="clear"/>
+          </w:tcPr>
+          <w:p>
+            <w:pPr>
+              <w:pStyle w:val="Tabelindhold"/>
+              <w:rPr>
+                <w:rFonts w:ascii="Verdana" w:hAnsi="Verdana" w:cs="Verdana"/>
+                <w:sz w:val="22"/>
+              </w:rPr>
+            </w:pPr>
+            <w:r>
+              <w:rPr>
+                <w:rFonts w:cs="Verdana" w:ascii="Verdana" w:hAnsi="Verdana"/>
+                <w:sz w:val="22"/>
+              </w:rPr>
+              <w:t>Tools</w:t>
+            </w:r>
+          </w:p>
+        </w:tc>
+        <w:tc>
+          <w:tcPr>
+            <w:tcW w:w="5219" w:type="dxa"/>
+            <w:tcBorders>
+              <w:left w:val="single" w:sz="2" w:space="0" w:color="000000"/>
+              <w:bottom w:val="single" w:sz="2" w:space="0" w:color="000000"/>
+            </w:tcBorders>
+            <w:shd w:fill="auto" w:val="clear"/>
+          </w:tcPr>
+          <w:p>
+            <w:pPr>
+              <w:pStyle w:val="Tabelindhold"/>
+              <w:rPr/>
+            </w:pPr>
+            <w:r>
+              <w:rPr>
+                <w:rFonts w:cs="Verdana" w:ascii="Verdana" w:hAnsi="Verdana"/>
+                <w:sz w:val="22"/>
+                <w:lang w:val="en-US"/>
+              </w:rPr>
+              <w:t>Open current MusicXml file as raw XML using Google Chrome</w:t>
+            </w:r>
+          </w:p>
+        </w:tc>
+        <w:tc>
+          <w:tcPr>
+            <w:tcW w:w="2215" w:type="dxa"/>
+            <w:tcBorders>
+              <w:left w:val="single" w:sz="2" w:space="0" w:color="000000"/>
+              <w:bottom w:val="single" w:sz="2" w:space="0" w:color="000000"/>
+              <w:right w:val="single" w:sz="2" w:space="0" w:color="000000"/>
+            </w:tcBorders>
+            <w:shd w:fill="auto" w:val="clear"/>
+          </w:tcPr>
+          <w:p>
+            <w:pPr>
+              <w:pStyle w:val="Tabelindhold"/>
+              <w:snapToGrid w:val="false"/>
+              <w:rPr>
+                <w:rFonts w:ascii="Verdana" w:hAnsi="Verdana" w:cs="Verdana"/>
+                <w:color w:val="C9211E"/>
+                <w:sz w:val="22"/>
+                <w:lang w:val="en-US"/>
+              </w:rPr>
+            </w:pPr>
+            <w:r>
+              <w:rPr>
+                <w:rFonts w:cs="Verdana" w:ascii="Verdana" w:hAnsi="Verdana"/>
+                <w:color w:val="C9211E"/>
+                <w:sz w:val="22"/>
+                <w:lang w:val="en-US"/>
+              </w:rPr>
+              <w:t>ALT + T + G</w:t>
+            </w:r>
+          </w:p>
+        </w:tc>
+      </w:tr>
+      <w:tr>
+        <w:trPr/>
+        <w:tc>
+          <w:tcPr>
+            <w:tcW w:w="1581" w:type="dxa"/>
+            <w:tcBorders>
+              <w:left w:val="single" w:sz="2" w:space="0" w:color="000000"/>
+              <w:bottom w:val="single" w:sz="2" w:space="0" w:color="000000"/>
+            </w:tcBorders>
+            <w:shd w:fill="auto" w:val="clear"/>
+          </w:tcPr>
+          <w:p>
+            <w:pPr>
+              <w:pStyle w:val="Tabelindhold"/>
+              <w:rPr>
+                <w:rFonts w:ascii="Verdana" w:hAnsi="Verdana" w:cs="Verdana"/>
+                <w:sz w:val="22"/>
+              </w:rPr>
+            </w:pPr>
+            <w:r>
+              <w:rPr>
+                <w:rFonts w:cs="Verdana" w:ascii="Verdana" w:hAnsi="Verdana"/>
+                <w:sz w:val="22"/>
+              </w:rPr>
+              <w:t>Tools</w:t>
+            </w:r>
+          </w:p>
+        </w:tc>
+        <w:tc>
+          <w:tcPr>
+            <w:tcW w:w="5219" w:type="dxa"/>
+            <w:tcBorders>
+              <w:left w:val="single" w:sz="2" w:space="0" w:color="000000"/>
+              <w:bottom w:val="single" w:sz="2" w:space="0" w:color="000000"/>
+            </w:tcBorders>
+            <w:shd w:fill="auto" w:val="clear"/>
+          </w:tcPr>
+          <w:p>
+            <w:pPr>
+              <w:pStyle w:val="Tabelindhold"/>
+              <w:rPr/>
+            </w:pPr>
+            <w:r>
+              <w:rPr>
+                <w:rFonts w:cs="Verdana" w:ascii="Verdana" w:hAnsi="Verdana"/>
+                <w:sz w:val="22"/>
+                <w:lang w:val="en-US"/>
+              </w:rPr>
+              <w:t>Open JAWS settings for IBOS MusicXmlReader</w:t>
+            </w:r>
+          </w:p>
+        </w:tc>
+        <w:tc>
+          <w:tcPr>
+            <w:tcW w:w="2215" w:type="dxa"/>
+            <w:tcBorders>
+              <w:left w:val="single" w:sz="2" w:space="0" w:color="000000"/>
+              <w:bottom w:val="single" w:sz="2" w:space="0" w:color="000000"/>
+              <w:right w:val="single" w:sz="2" w:space="0" w:color="000000"/>
+            </w:tcBorders>
+            <w:shd w:fill="auto" w:val="clear"/>
+          </w:tcPr>
+          <w:p>
+            <w:pPr>
+              <w:pStyle w:val="Tabelindhold"/>
+              <w:snapToGrid w:val="false"/>
+              <w:rPr>
+                <w:rFonts w:ascii="Verdana" w:hAnsi="Verdana" w:cs="Verdana"/>
+                <w:color w:val="C9211E"/>
+                <w:sz w:val="22"/>
+                <w:lang w:val="en-US"/>
+              </w:rPr>
+            </w:pPr>
+            <w:r>
+              <w:rPr>
+                <w:rFonts w:cs="Verdana" w:ascii="Verdana" w:hAnsi="Verdana"/>
+                <w:color w:val="C9211E"/>
+                <w:sz w:val="22"/>
+                <w:lang w:val="en-US"/>
+              </w:rPr>
+              <w:t>ALT + T + J</w:t>
+            </w:r>
+          </w:p>
+        </w:tc>
+      </w:tr>
+      <w:tr>
+        <w:trPr/>
+        <w:tc>
+          <w:tcPr>
+            <w:tcW w:w="1581" w:type="dxa"/>
+            <w:tcBorders>
+              <w:left w:val="single" w:sz="2" w:space="0" w:color="000000"/>
+              <w:bottom w:val="single" w:sz="2" w:space="0" w:color="000000"/>
+            </w:tcBorders>
+            <w:shd w:fill="auto" w:val="clear"/>
+          </w:tcPr>
+          <w:p>
+            <w:pPr>
+              <w:pStyle w:val="Tabelindhold"/>
+              <w:rPr>
+                <w:rFonts w:ascii="Verdana" w:hAnsi="Verdana" w:cs="Verdana"/>
+                <w:sz w:val="22"/>
+              </w:rPr>
+            </w:pPr>
+            <w:r>
+              <w:rPr>
+                <w:rFonts w:cs="Verdana" w:ascii="Verdana" w:hAnsi="Verdana"/>
+                <w:sz w:val="22"/>
+              </w:rPr>
+              <w:t>Tools</w:t>
+            </w:r>
+          </w:p>
+        </w:tc>
+        <w:tc>
+          <w:tcPr>
+            <w:tcW w:w="5219" w:type="dxa"/>
+            <w:tcBorders>
+              <w:left w:val="single" w:sz="2" w:space="0" w:color="000000"/>
+              <w:bottom w:val="single" w:sz="2" w:space="0" w:color="000000"/>
+            </w:tcBorders>
+            <w:shd w:fill="auto" w:val="clear"/>
+          </w:tcPr>
+          <w:p>
+            <w:pPr>
+              <w:pStyle w:val="Tabelindhold"/>
+              <w:rPr>
+                <w:rFonts w:ascii="Verdana" w:hAnsi="Verdana" w:cs="Verdana"/>
+                <w:sz w:val="22"/>
+                <w:lang w:val="en-US"/>
+              </w:rPr>
+            </w:pPr>
+            <w:r>
+              <w:rPr>
+                <w:rFonts w:cs="Verdana" w:ascii="Verdana" w:hAnsi="Verdana"/>
+                <w:sz w:val="22"/>
+                <w:lang w:val="en-US"/>
+              </w:rPr>
+              <w:t>Open user settings as raw XML</w:t>
+            </w:r>
+          </w:p>
+        </w:tc>
+        <w:tc>
+          <w:tcPr>
+            <w:tcW w:w="2215" w:type="dxa"/>
+            <w:tcBorders>
+              <w:left w:val="single" w:sz="2" w:space="0" w:color="000000"/>
+              <w:bottom w:val="single" w:sz="2" w:space="0" w:color="000000"/>
+              <w:right w:val="single" w:sz="2" w:space="0" w:color="000000"/>
+            </w:tcBorders>
+            <w:shd w:fill="auto" w:val="clear"/>
+          </w:tcPr>
+          <w:p>
+            <w:pPr>
+              <w:pStyle w:val="Tabelindhold"/>
+              <w:snapToGrid w:val="false"/>
+              <w:rPr>
+                <w:rFonts w:ascii="Verdana" w:hAnsi="Verdana" w:cs="Verdana"/>
+                <w:color w:val="C9211E"/>
+                <w:sz w:val="22"/>
+                <w:lang w:val="en-US"/>
+              </w:rPr>
+            </w:pPr>
+            <w:r>
+              <w:rPr>
+                <w:rFonts w:cs="Verdana" w:ascii="Verdana" w:hAnsi="Verdana"/>
+                <w:color w:val="C9211E"/>
+                <w:sz w:val="22"/>
+                <w:lang w:val="en-US"/>
+              </w:rPr>
+              <w:t>ALT + T + U</w:t>
+            </w:r>
+          </w:p>
+        </w:tc>
+      </w:tr>
+      <w:tr>
+        <w:trPr/>
+        <w:tc>
+          <w:tcPr>
+            <w:tcW w:w="1581" w:type="dxa"/>
             <w:tcBorders>
               <w:left w:val="single" w:sz="2" w:space="0" w:color="000000"/>
               <w:bottom w:val="single" w:sz="2" w:space="0" w:color="000000"/>
@@ -5981,7 +6404,7 @@
         </w:tc>
         <w:tc>
           <w:tcPr>
-            <w:tcW w:w="2214" w:type="dxa"/>
+            <w:tcW w:w="2215" w:type="dxa"/>
             <w:tcBorders>
               <w:left w:val="single" w:sz="2" w:space="0" w:color="000000"/>
               <w:bottom w:val="single" w:sz="2" w:space="0" w:color="000000"/>
@@ -5995,6 +6418,7 @@
               <w:snapToGrid w:val="false"/>
               <w:rPr>
                 <w:rFonts w:ascii="Verdana" w:hAnsi="Verdana" w:cs="Verdana"/>
+                <w:color w:val="C9211E"/>
                 <w:sz w:val="22"/>
                 <w:lang w:val="en-US"/>
               </w:rPr>
@@ -6002,9 +6426,11 @@
             <w:r>
               <w:rPr>
                 <w:rFonts w:cs="Verdana" w:ascii="Verdana" w:hAnsi="Verdana"/>
+                <w:color w:val="C9211E"/>
                 <w:sz w:val="22"/>
                 <w:lang w:val="en-US"/>
               </w:rPr>
+              <w:t>ALT + N</w:t>
             </w:r>
           </w:p>
         </w:tc>
@@ -6013,7 +6439,7 @@
         <w:trPr/>
         <w:tc>
           <w:tcPr>
-            <w:tcW w:w="1582" w:type="dxa"/>
+            <w:tcW w:w="1581" w:type="dxa"/>
             <w:tcBorders>
               <w:left w:val="single" w:sz="2" w:space="0" w:color="000000"/>
               <w:bottom w:val="single" w:sz="2" w:space="0" w:color="000000"/>
@@ -6113,7 +6539,7 @@
         </w:tc>
         <w:tc>
           <w:tcPr>
-            <w:tcW w:w="2214" w:type="dxa"/>
+            <w:tcW w:w="2215" w:type="dxa"/>
             <w:tcBorders>
               <w:left w:val="single" w:sz="2" w:space="0" w:color="000000"/>
               <w:bottom w:val="single" w:sz="2" w:space="0" w:color="000000"/>
@@ -6127,6 +6553,7 @@
               <w:snapToGrid w:val="false"/>
               <w:rPr>
                 <w:rFonts w:ascii="Verdana" w:hAnsi="Verdana" w:cs="Verdana"/>
+                <w:color w:val="C9211E"/>
                 <w:sz w:val="22"/>
                 <w:lang w:val="en-US"/>
               </w:rPr>
@@ -6134,9 +6561,74 @@
             <w:r>
               <w:rPr>
                 <w:rFonts w:cs="Verdana" w:ascii="Verdana" w:hAnsi="Verdana"/>
+                <w:color w:val="C9211E"/>
                 <w:sz w:val="22"/>
                 <w:lang w:val="en-US"/>
               </w:rPr>
+              <w:t>ALT + H + A</w:t>
+            </w:r>
+          </w:p>
+          <w:p>
+            <w:pPr>
+              <w:pStyle w:val="Tabelindhold"/>
+              <w:snapToGrid w:val="false"/>
+              <w:rPr>
+                <w:rFonts w:ascii="Verdana" w:hAnsi="Verdana" w:cs="Verdana"/>
+                <w:color w:val="C9211E"/>
+                <w:sz w:val="22"/>
+                <w:lang w:val="en-US"/>
+              </w:rPr>
+            </w:pPr>
+            <w:r>
+              <w:rPr>
+                <w:rFonts w:cs="Verdana" w:ascii="Verdana" w:hAnsi="Verdana"/>
+                <w:color w:val="C9211E"/>
+                <w:sz w:val="22"/>
+                <w:lang w:val="en-US"/>
+              </w:rPr>
+              <w:t>ALT + H + K</w:t>
+            </w:r>
+          </w:p>
+          <w:p>
+            <w:pPr>
+              <w:pStyle w:val="Tabelindhold"/>
+              <w:snapToGrid w:val="false"/>
+              <w:rPr>
+                <w:rFonts w:ascii="Verdana" w:hAnsi="Verdana" w:cs="Verdana"/>
+                <w:color w:val="C9211E"/>
+                <w:sz w:val="22"/>
+                <w:lang w:val="en-US"/>
+              </w:rPr>
+            </w:pPr>
+            <w:r>
+              <w:rPr>
+                <w:rFonts w:cs="Verdana" w:ascii="Verdana" w:hAnsi="Verdana"/>
+                <w:color w:val="C9211E"/>
+                <w:sz w:val="22"/>
+                <w:lang w:val="en-US"/>
+              </w:rPr>
+              <w:t>ALT + H + S</w:t>
+            </w:r>
+          </w:p>
+          <w:p>
+            <w:pPr>
+              <w:pStyle w:val="Tabelindhold"/>
+              <w:snapToGrid w:val="false"/>
+              <w:rPr>
+                <w:rFonts w:ascii="Verdana" w:hAnsi="Verdana" w:cs="Verdana"/>
+                <w:color w:val="C9211E"/>
+                <w:sz w:val="22"/>
+                <w:lang w:val="en-US"/>
+              </w:rPr>
+            </w:pPr>
+            <w:r>
+              <w:rPr>
+                <w:rFonts w:cs="Verdana" w:ascii="Verdana" w:hAnsi="Verdana"/>
+                <w:color w:val="C9211E"/>
+                <w:sz w:val="22"/>
+                <w:lang w:val="en-US"/>
+              </w:rPr>
+              <w:t>ALT + H + U</w:t>
             </w:r>
           </w:p>
         </w:tc>
@@ -6929,6 +7421,126 @@
           </w:p>
         </w:tc>
       </w:tr>
+      <w:tr>
+        <w:trPr/>
+        <w:tc>
+          <w:tcPr>
+            <w:tcW w:w="2261" w:type="dxa"/>
+            <w:tcBorders>
+              <w:left w:val="single" w:sz="4" w:space="0" w:color="000000"/>
+              <w:bottom w:val="single" w:sz="4" w:space="0" w:color="000000"/>
+            </w:tcBorders>
+            <w:shd w:fill="auto" w:val="clear"/>
+          </w:tcPr>
+          <w:p>
+            <w:pPr>
+              <w:pStyle w:val="Tabelindhold"/>
+              <w:rPr>
+                <w:color w:val="C9211E"/>
+              </w:rPr>
+            </w:pPr>
+            <w:r>
+              <w:rPr>
+                <w:color w:val="C9211E"/>
+              </w:rPr>
+              <w:t>PhotoScore path</w:t>
+            </w:r>
+          </w:p>
+        </w:tc>
+        <w:tc>
+          <w:tcPr>
+            <w:tcW w:w="6764" w:type="dxa"/>
+            <w:tcBorders>
+              <w:left w:val="single" w:sz="4" w:space="0" w:color="000000"/>
+              <w:bottom w:val="single" w:sz="4" w:space="0" w:color="000000"/>
+              <w:right w:val="single" w:sz="4" w:space="0" w:color="000000"/>
+            </w:tcBorders>
+            <w:shd w:fill="auto" w:val="clear"/>
+          </w:tcPr>
+          <w:p>
+            <w:pPr>
+              <w:pStyle w:val="Tabelindhold"/>
+              <w:rPr>
+                <w:color w:val="C9211E"/>
+              </w:rPr>
+            </w:pPr>
+            <w:r>
+              <w:rPr>
+                <w:color w:val="C9211E"/>
+              </w:rPr>
+              <w:t xml:space="preserve">Path to .exe file for the installed version of </w:t>
+            </w:r>
+            <w:r>
+              <w:rPr>
+                <w:color w:val="C9211E"/>
+              </w:rPr>
+              <w:t>PhotoScore</w:t>
+            </w:r>
+          </w:p>
+        </w:tc>
+      </w:tr>
+      <w:tr>
+        <w:trPr/>
+        <w:tc>
+          <w:tcPr>
+            <w:tcW w:w="2261" w:type="dxa"/>
+            <w:tcBorders>
+              <w:left w:val="single" w:sz="4" w:space="0" w:color="000000"/>
+              <w:bottom w:val="single" w:sz="4" w:space="0" w:color="000000"/>
+            </w:tcBorders>
+            <w:shd w:fill="auto" w:val="clear"/>
+          </w:tcPr>
+          <w:p>
+            <w:pPr>
+              <w:pStyle w:val="Tabelindhold"/>
+              <w:rPr>
+                <w:color w:val="C9211E"/>
+                <w:sz w:val="22"/>
+                <w:szCs w:val="22"/>
+              </w:rPr>
+            </w:pPr>
+            <w:r>
+              <w:rPr>
+                <w:color w:val="C9211E"/>
+                <w:sz w:val="22"/>
+                <w:szCs w:val="22"/>
+              </w:rPr>
+              <w:t>Braille Music Editor 2</w:t>
+            </w:r>
+          </w:p>
+        </w:tc>
+        <w:tc>
+          <w:tcPr>
+            <w:tcW w:w="6764" w:type="dxa"/>
+            <w:tcBorders>
+              <w:left w:val="single" w:sz="4" w:space="0" w:color="000000"/>
+              <w:bottom w:val="single" w:sz="4" w:space="0" w:color="000000"/>
+              <w:right w:val="single" w:sz="4" w:space="0" w:color="000000"/>
+            </w:tcBorders>
+            <w:shd w:fill="auto" w:val="clear"/>
+          </w:tcPr>
+          <w:p>
+            <w:pPr>
+              <w:pStyle w:val="Tabelindhold"/>
+              <w:rPr>
+                <w:color w:val="C9211E"/>
+              </w:rPr>
+            </w:pPr>
+            <w:r>
+              <w:rPr>
+                <w:color w:val="C9211E"/>
+              </w:rPr>
+              <w:t xml:space="preserve">Path to .exe file for the installed version of  </w:t>
+            </w:r>
+            <w:r>
+              <w:rPr>
+                <w:color w:val="C9211E"/>
+              </w:rPr>
+              <w:t>Braille Music Editor 2</w:t>
+            </w:r>
+          </w:p>
+        </w:tc>
+      </w:tr>
     </w:tbl>
     <w:p>
       <w:pPr>
@@ -6979,21 +7591,31 @@
           <w:ilvl w:val="2"/>
           <w:numId w:val="3"/>
         </w:numPr>
+        <w:rPr/>
+      </w:pPr>
+      <w:bookmarkStart w:id="8" w:name="__RefHeading___Toc531086864"/>
+      <w:bookmarkEnd w:id="8"/>
+      <w:r>
         <w:rPr>
           <w:rFonts w:ascii="Verdana" w:hAnsi="Verdana"/>
           <w:sz w:val="28"/>
           <w:szCs w:val="28"/>
         </w:rPr>
-      </w:pPr>
-      <w:bookmarkStart w:id="8" w:name="__RefHeading___Toc531086864"/>
-      <w:bookmarkEnd w:id="8"/>
-      <w:r>
+        <w:t>Tools</w:t>
+      </w:r>
+    </w:p>
+    <w:p>
+      <w:pPr>
+        <w:pStyle w:val="Normal"/>
         <w:rPr>
           <w:rFonts w:ascii="Verdana" w:hAnsi="Verdana"/>
-          <w:sz w:val="28"/>
-          <w:szCs w:val="28"/>
-        </w:rPr>
-        <w:t>Tools</w:t>
+        </w:rPr>
+      </w:pPr>
+      <w:r>
+        <w:rPr>
+          <w:sz w:val="22"/>
+          <w:szCs w:val="22"/>
+        </w:rPr>
       </w:r>
     </w:p>
     <w:p>
@@ -7003,9 +7625,51 @@
       </w:pPr>
       <w:r>
         <w:rPr>
-          <w:rFonts w:cs="Verdana" w:ascii="Verdana" w:hAnsi="Verdana"/>
-        </w:rPr>
-        <w:t>The "MuseScore", "Sibelius", “Capella and “Finale” items under "Tools" start external programs with the MusicXml file currently open in IBOS MusicXmlReader. This is an advantage in situations where the user has the help of a person with normal vision who can view the graphical score. Of course, this function requires that the relevant applications are installed on the PC.</w:t>
+          <w:rFonts w:ascii="Verdana" w:hAnsi="Verdana"/>
+          <w:color w:val="C9211E"/>
+          <w:sz w:val="22"/>
+          <w:szCs w:val="22"/>
+        </w:rPr>
+        <w:t>The “IBOS Music Braille Reader” item under “Tools” will start the integrated tool “IBOS Music Braille Reader”.  Using that tool the user can open exixting NOTA Music Braille files or files, just generated and exported by “IBOS Music Xml Reader”. The contents of the Music Braille file will be shown in a listbox in a textual representation.</w:t>
+      </w:r>
+    </w:p>
+    <w:p>
+      <w:pPr>
+        <w:pStyle w:val="Normal"/>
+        <w:rPr/>
+      </w:pPr>
+      <w:r>
+        <w:rPr>
+          <w:rFonts w:cs="Verdana" w:ascii="Verdana" w:hAnsi="Verdana"/>
+        </w:rPr>
+        <w:t xml:space="preserve">The "MuseScore", "Sibelius", “Capella”, “Finale” , </w:t>
+      </w:r>
+      <w:r>
+        <w:rPr>
+          <w:rFonts w:cs="Verdana" w:ascii="Verdana" w:hAnsi="Verdana"/>
+          <w:color w:val="C9211E"/>
+        </w:rPr>
+        <w:t xml:space="preserve"> "PhotoScore" </w:t>
+      </w:r>
+      <w:r>
+        <w:rPr>
+          <w:rFonts w:cs="Verdana" w:ascii="Verdana" w:hAnsi="Verdana"/>
+          <w:color w:val="C9211E"/>
+        </w:rPr>
+        <w:t>and</w:t>
+      </w:r>
+      <w:r>
+        <w:rPr>
+          <w:rFonts w:cs="Verdana" w:ascii="Verdana" w:hAnsi="Verdana"/>
+          <w:color w:val="C9211E"/>
+        </w:rPr>
+        <w:t xml:space="preserve"> "Braille MusicEditor 2” </w:t>
+      </w:r>
+      <w:r>
+        <w:rPr>
+          <w:rFonts w:cs="Verdana" w:ascii="Verdana" w:hAnsi="Verdana"/>
+        </w:rPr>
+        <w:t>items under "Tools" start external programs with the MusicXml file currently open in IBOS MusicXmlReader. This is an advantage in situations where the user has the help of a person with normal vision who can view the graphical score. Of course, this function requires that the relevant applications are installed on the PC.</w:t>
       </w:r>
     </w:p>
     <w:p>
@@ -7321,15 +7985,15 @@
         </w:tblCellMar>
       </w:tblPr>
       <w:tblGrid>
-        <w:gridCol w:w="3231"/>
-        <w:gridCol w:w="2309"/>
-        <w:gridCol w:w="3415"/>
+        <w:gridCol w:w="3230"/>
+        <w:gridCol w:w="2308"/>
+        <w:gridCol w:w="3417"/>
       </w:tblGrid>
       <w:tr>
         <w:trPr/>
         <w:tc>
           <w:tcPr>
-            <w:tcW w:w="3231" w:type="dxa"/>
+            <w:tcW w:w="3230" w:type="dxa"/>
             <w:tcBorders/>
             <w:shd w:fill="auto" w:val="clear"/>
           </w:tcPr>
@@ -7350,7 +8014,7 @@
         </w:tc>
         <w:tc>
           <w:tcPr>
-            <w:tcW w:w="2309" w:type="dxa"/>
+            <w:tcW w:w="2308" w:type="dxa"/>
             <w:tcBorders/>
             <w:shd w:fill="auto" w:val="clear"/>
           </w:tcPr>
@@ -7371,7 +8035,7 @@
         </w:tc>
         <w:tc>
           <w:tcPr>
-            <w:tcW w:w="3415" w:type="dxa"/>
+            <w:tcW w:w="3417" w:type="dxa"/>
             <w:tcBorders/>
             <w:shd w:fill="auto" w:val="clear"/>
           </w:tcPr>
@@ -7395,7 +8059,7 @@
         <w:trPr/>
         <w:tc>
           <w:tcPr>
-            <w:tcW w:w="3231" w:type="dxa"/>
+            <w:tcW w:w="3230" w:type="dxa"/>
             <w:tcBorders/>
             <w:shd w:fill="auto" w:val="clear"/>
           </w:tcPr>
@@ -7415,7 +8079,7 @@
         </w:tc>
         <w:tc>
           <w:tcPr>
-            <w:tcW w:w="2309" w:type="dxa"/>
+            <w:tcW w:w="2308" w:type="dxa"/>
             <w:tcBorders/>
             <w:shd w:fill="auto" w:val="clear"/>
           </w:tcPr>
@@ -7438,7 +8102,7 @@
         </w:tc>
         <w:tc>
           <w:tcPr>
-            <w:tcW w:w="3415" w:type="dxa"/>
+            <w:tcW w:w="3417" w:type="dxa"/>
             <w:tcBorders/>
             <w:shd w:fill="auto" w:val="clear"/>
           </w:tcPr>
@@ -7487,7 +8151,7 @@
         <w:trPr/>
         <w:tc>
           <w:tcPr>
-            <w:tcW w:w="3231" w:type="dxa"/>
+            <w:tcW w:w="3230" w:type="dxa"/>
             <w:tcBorders/>
             <w:shd w:fill="auto" w:val="clear"/>
           </w:tcPr>
@@ -7507,7 +8171,7 @@
         </w:tc>
         <w:tc>
           <w:tcPr>
-            <w:tcW w:w="2309" w:type="dxa"/>
+            <w:tcW w:w="2308" w:type="dxa"/>
             <w:tcBorders/>
             <w:shd w:fill="auto" w:val="clear"/>
           </w:tcPr>
@@ -7546,7 +8210,7 @@
         </w:tc>
         <w:tc>
           <w:tcPr>
-            <w:tcW w:w="3415" w:type="dxa"/>
+            <w:tcW w:w="3417" w:type="dxa"/>
             <w:tcBorders/>
             <w:shd w:fill="auto" w:val="clear"/>
           </w:tcPr>
@@ -7572,7 +8236,7 @@
         <w:trPr/>
         <w:tc>
           <w:tcPr>
-            <w:tcW w:w="3231" w:type="dxa"/>
+            <w:tcW w:w="3230" w:type="dxa"/>
             <w:tcBorders/>
             <w:shd w:fill="auto" w:val="clear"/>
           </w:tcPr>
@@ -7592,7 +8256,7 @@
         </w:tc>
         <w:tc>
           <w:tcPr>
-            <w:tcW w:w="2309" w:type="dxa"/>
+            <w:tcW w:w="2308" w:type="dxa"/>
             <w:tcBorders/>
             <w:shd w:fill="auto" w:val="clear"/>
           </w:tcPr>
@@ -7615,7 +8279,7 @@
         </w:tc>
         <w:tc>
           <w:tcPr>
-            <w:tcW w:w="3415" w:type="dxa"/>
+            <w:tcW w:w="3417" w:type="dxa"/>
             <w:tcBorders/>
             <w:shd w:fill="auto" w:val="clear"/>
           </w:tcPr>
@@ -7641,7 +8305,7 @@
         <w:trPr/>
         <w:tc>
           <w:tcPr>
-            <w:tcW w:w="3231" w:type="dxa"/>
+            <w:tcW w:w="3230" w:type="dxa"/>
             <w:tcBorders/>
             <w:shd w:fill="auto" w:val="clear"/>
           </w:tcPr>
@@ -7664,7 +8328,7 @@
         </w:tc>
         <w:tc>
           <w:tcPr>
-            <w:tcW w:w="2309" w:type="dxa"/>
+            <w:tcW w:w="2308" w:type="dxa"/>
             <w:tcBorders/>
             <w:shd w:fill="auto" w:val="clear"/>
           </w:tcPr>
@@ -7684,7 +8348,7 @@
         </w:tc>
         <w:tc>
           <w:tcPr>
-            <w:tcW w:w="3415" w:type="dxa"/>
+            <w:tcW w:w="3417" w:type="dxa"/>
             <w:tcBorders/>
             <w:shd w:fill="auto" w:val="clear"/>
           </w:tcPr>
@@ -7710,7 +8374,7 @@
         <w:trPr/>
         <w:tc>
           <w:tcPr>
-            <w:tcW w:w="3231" w:type="dxa"/>
+            <w:tcW w:w="3230" w:type="dxa"/>
             <w:tcBorders/>
             <w:shd w:fill="auto" w:val="clear"/>
           </w:tcPr>
@@ -7733,7 +8397,7 @@
         </w:tc>
         <w:tc>
           <w:tcPr>
-            <w:tcW w:w="2309" w:type="dxa"/>
+            <w:tcW w:w="2308" w:type="dxa"/>
             <w:tcBorders/>
             <w:shd w:fill="auto" w:val="clear"/>
           </w:tcPr>
@@ -7756,7 +8420,7 @@
         </w:tc>
         <w:tc>
           <w:tcPr>
-            <w:tcW w:w="3415" w:type="dxa"/>
+            <w:tcW w:w="3417" w:type="dxa"/>
             <w:tcBorders/>
             <w:shd w:fill="auto" w:val="clear"/>
           </w:tcPr>
@@ -7880,15 +8544,15 @@
         </w:tblCellMar>
       </w:tblPr>
       <w:tblGrid>
-        <w:gridCol w:w="3231"/>
-        <w:gridCol w:w="2339"/>
-        <w:gridCol w:w="3445"/>
+        <w:gridCol w:w="3230"/>
+        <w:gridCol w:w="2338"/>
+        <w:gridCol w:w="3447"/>
       </w:tblGrid>
       <w:tr>
         <w:trPr/>
         <w:tc>
           <w:tcPr>
-            <w:tcW w:w="3231" w:type="dxa"/>
+            <w:tcW w:w="3230" w:type="dxa"/>
             <w:tcBorders/>
             <w:shd w:fill="auto" w:val="clear"/>
           </w:tcPr>
@@ -7911,7 +8575,7 @@
         </w:tc>
         <w:tc>
           <w:tcPr>
-            <w:tcW w:w="2339" w:type="dxa"/>
+            <w:tcW w:w="2338" w:type="dxa"/>
             <w:tcBorders/>
             <w:shd w:fill="auto" w:val="clear"/>
           </w:tcPr>
@@ -7934,7 +8598,7 @@
         </w:tc>
         <w:tc>
           <w:tcPr>
-            <w:tcW w:w="3445" w:type="dxa"/>
+            <w:tcW w:w="3447" w:type="dxa"/>
             <w:tcBorders/>
             <w:shd w:fill="auto" w:val="clear"/>
           </w:tcPr>
@@ -7960,7 +8624,7 @@
         <w:trPr/>
         <w:tc>
           <w:tcPr>
-            <w:tcW w:w="3231" w:type="dxa"/>
+            <w:tcW w:w="3230" w:type="dxa"/>
             <w:tcBorders/>
             <w:shd w:fill="auto" w:val="clear"/>
           </w:tcPr>
@@ -7983,7 +8647,7 @@
         </w:tc>
         <w:tc>
           <w:tcPr>
-            <w:tcW w:w="2339" w:type="dxa"/>
+            <w:tcW w:w="2338" w:type="dxa"/>
             <w:tcBorders/>
             <w:shd w:fill="auto" w:val="clear"/>
           </w:tcPr>
@@ -8006,7 +8670,7 @@
         </w:tc>
         <w:tc>
           <w:tcPr>
-            <w:tcW w:w="3445" w:type="dxa"/>
+            <w:tcW w:w="3447" w:type="dxa"/>
             <w:tcBorders/>
             <w:shd w:fill="auto" w:val="clear"/>
           </w:tcPr>
@@ -8427,14 +9091,14 @@
         </w:tblCellMar>
       </w:tblPr>
       <w:tblGrid>
-        <w:gridCol w:w="1792"/>
-        <w:gridCol w:w="7162"/>
+        <w:gridCol w:w="1791"/>
+        <w:gridCol w:w="7163"/>
       </w:tblGrid>
       <w:tr>
         <w:trPr/>
         <w:tc>
           <w:tcPr>
-            <w:tcW w:w="1792" w:type="dxa"/>
+            <w:tcW w:w="1791" w:type="dxa"/>
             <w:tcBorders/>
             <w:shd w:fill="auto" w:val="clear"/>
           </w:tcPr>
@@ -8457,7 +9121,7 @@
         </w:tc>
         <w:tc>
           <w:tcPr>
-            <w:tcW w:w="7162" w:type="dxa"/>
+            <w:tcW w:w="7163" w:type="dxa"/>
             <w:tcBorders/>
             <w:shd w:fill="auto" w:val="clear"/>
           </w:tcPr>
@@ -8483,7 +9147,7 @@
         <w:trPr/>
         <w:tc>
           <w:tcPr>
-            <w:tcW w:w="1792" w:type="dxa"/>
+            <w:tcW w:w="1791" w:type="dxa"/>
             <w:tcBorders/>
             <w:shd w:fill="auto" w:val="clear"/>
           </w:tcPr>
@@ -8504,7 +9168,7 @@
         </w:tc>
         <w:tc>
           <w:tcPr>
-            <w:tcW w:w="7162" w:type="dxa"/>
+            <w:tcW w:w="7163" w:type="dxa"/>
             <w:tcBorders/>
             <w:shd w:fill="auto" w:val="clear"/>
           </w:tcPr>
@@ -8526,7 +9190,7 @@
         <w:trPr/>
         <w:tc>
           <w:tcPr>
-            <w:tcW w:w="1792" w:type="dxa"/>
+            <w:tcW w:w="1791" w:type="dxa"/>
             <w:tcBorders/>
             <w:shd w:fill="auto" w:val="clear"/>
           </w:tcPr>
@@ -8547,7 +9211,7 @@
         </w:tc>
         <w:tc>
           <w:tcPr>
-            <w:tcW w:w="7162" w:type="dxa"/>
+            <w:tcW w:w="7163" w:type="dxa"/>
             <w:tcBorders/>
             <w:shd w:fill="auto" w:val="clear"/>
           </w:tcPr>
@@ -8571,7 +9235,7 @@
         <w:trPr/>
         <w:tc>
           <w:tcPr>
-            <w:tcW w:w="1792" w:type="dxa"/>
+            <w:tcW w:w="1791" w:type="dxa"/>
             <w:tcBorders/>
             <w:shd w:fill="auto" w:val="clear"/>
           </w:tcPr>
@@ -8592,7 +9256,7 @@
         </w:tc>
         <w:tc>
           <w:tcPr>
-            <w:tcW w:w="7162" w:type="dxa"/>
+            <w:tcW w:w="7163" w:type="dxa"/>
             <w:tcBorders/>
             <w:shd w:fill="auto" w:val="clear"/>
           </w:tcPr>
@@ -8618,7 +9282,7 @@
         </w:trPr>
         <w:tc>
           <w:tcPr>
-            <w:tcW w:w="1792" w:type="dxa"/>
+            <w:tcW w:w="1791" w:type="dxa"/>
             <w:tcBorders/>
             <w:shd w:fill="auto" w:val="clear"/>
           </w:tcPr>
@@ -8639,7 +9303,7 @@
         </w:tc>
         <w:tc>
           <w:tcPr>
-            <w:tcW w:w="7162" w:type="dxa"/>
+            <w:tcW w:w="7163" w:type="dxa"/>
             <w:tcBorders/>
             <w:shd w:fill="auto" w:val="clear"/>
           </w:tcPr>
@@ -8663,7 +9327,7 @@
         <w:trPr/>
         <w:tc>
           <w:tcPr>
-            <w:tcW w:w="1792" w:type="dxa"/>
+            <w:tcW w:w="1791" w:type="dxa"/>
             <w:tcBorders/>
             <w:shd w:fill="auto" w:val="clear"/>
           </w:tcPr>
@@ -8684,7 +9348,7 @@
         </w:tc>
         <w:tc>
           <w:tcPr>
-            <w:tcW w:w="7162" w:type="dxa"/>
+            <w:tcW w:w="7163" w:type="dxa"/>
             <w:tcBorders/>
             <w:shd w:fill="auto" w:val="clear"/>
           </w:tcPr>
@@ -8706,7 +9370,7 @@
         <w:trPr/>
         <w:tc>
           <w:tcPr>
-            <w:tcW w:w="1792" w:type="dxa"/>
+            <w:tcW w:w="1791" w:type="dxa"/>
             <w:tcBorders/>
             <w:shd w:fill="auto" w:val="clear"/>
           </w:tcPr>
@@ -8727,7 +9391,7 @@
         </w:tc>
         <w:tc>
           <w:tcPr>
-            <w:tcW w:w="7162" w:type="dxa"/>
+            <w:tcW w:w="7163" w:type="dxa"/>
             <w:tcBorders/>
             <w:shd w:fill="auto" w:val="clear"/>
           </w:tcPr>
@@ -8765,7 +9429,7 @@
         <w:trPr/>
         <w:tc>
           <w:tcPr>
-            <w:tcW w:w="1792" w:type="dxa"/>
+            <w:tcW w:w="1791" w:type="dxa"/>
             <w:tcBorders/>
             <w:shd w:fill="auto" w:val="clear"/>
           </w:tcPr>
@@ -8786,7 +9450,7 @@
         </w:tc>
         <w:tc>
           <w:tcPr>
-            <w:tcW w:w="7162" w:type="dxa"/>
+            <w:tcW w:w="7163" w:type="dxa"/>
             <w:tcBorders/>
             <w:shd w:fill="auto" w:val="clear"/>
           </w:tcPr>
@@ -8885,14 +9549,14 @@
         </w:tblCellMar>
       </w:tblPr>
       <w:tblGrid>
-        <w:gridCol w:w="2201"/>
-        <w:gridCol w:w="7443"/>
+        <w:gridCol w:w="2200"/>
+        <w:gridCol w:w="7444"/>
       </w:tblGrid>
       <w:tr>
         <w:trPr/>
         <w:tc>
           <w:tcPr>
-            <w:tcW w:w="2201" w:type="dxa"/>
+            <w:tcW w:w="2200" w:type="dxa"/>
             <w:tcBorders/>
             <w:shd w:fill="auto" w:val="clear"/>
           </w:tcPr>
@@ -8911,7 +9575,7 @@
         </w:tc>
         <w:tc>
           <w:tcPr>
-            <w:tcW w:w="7443" w:type="dxa"/>
+            <w:tcW w:w="7444" w:type="dxa"/>
             <w:tcBorders/>
             <w:shd w:fill="auto" w:val="clear"/>
           </w:tcPr>
@@ -8935,7 +9599,7 @@
         <w:trPr/>
         <w:tc>
           <w:tcPr>
-            <w:tcW w:w="2201" w:type="dxa"/>
+            <w:tcW w:w="2200" w:type="dxa"/>
             <w:tcBorders/>
             <w:shd w:fill="auto" w:val="clear"/>
           </w:tcPr>
@@ -8954,7 +9618,7 @@
         </w:tc>
         <w:tc>
           <w:tcPr>
-            <w:tcW w:w="7443" w:type="dxa"/>
+            <w:tcW w:w="7444" w:type="dxa"/>
             <w:tcBorders/>
             <w:shd w:fill="auto" w:val="clear"/>
           </w:tcPr>
@@ -8976,7 +9640,7 @@
         <w:trPr/>
         <w:tc>
           <w:tcPr>
-            <w:tcW w:w="2201" w:type="dxa"/>
+            <w:tcW w:w="2200" w:type="dxa"/>
             <w:tcBorders/>
             <w:shd w:fill="auto" w:val="clear"/>
           </w:tcPr>
@@ -8995,7 +9659,7 @@
         </w:tc>
         <w:tc>
           <w:tcPr>
-            <w:tcW w:w="7443" w:type="dxa"/>
+            <w:tcW w:w="7444" w:type="dxa"/>
             <w:tcBorders/>
             <w:shd w:fill="auto" w:val="clear"/>
           </w:tcPr>
@@ -9017,7 +9681,7 @@
         <w:trPr/>
         <w:tc>
           <w:tcPr>
-            <w:tcW w:w="2201" w:type="dxa"/>
+            <w:tcW w:w="2200" w:type="dxa"/>
             <w:tcBorders/>
             <w:shd w:fill="auto" w:val="clear"/>
           </w:tcPr>
@@ -9036,7 +9700,7 @@
         </w:tc>
         <w:tc>
           <w:tcPr>
-            <w:tcW w:w="7443" w:type="dxa"/>
+            <w:tcW w:w="7444" w:type="dxa"/>
             <w:tcBorders/>
             <w:shd w:fill="auto" w:val="clear"/>
           </w:tcPr>
@@ -11378,7 +12042,19 @@
         <w:rPr>
           <w:rFonts w:cs="Verdana" w:ascii="Verdana" w:hAnsi="Verdana"/>
         </w:rPr>
-        <w:t>Version 4.0 supports “ASCII”, “OctoBraille 1252” and “Unicode”</w:t>
+        <w:t>Version 4.0 supports “ASCII”, “OctoBraille 1252”, “</w:t>
+      </w:r>
+      <w:r>
+        <w:rPr>
+          <w:rFonts w:cs="Verdana" w:ascii="Verdana" w:hAnsi="Verdana"/>
+        </w:rPr>
+        <w:t>PEF</w:t>
+      </w:r>
+      <w:r>
+        <w:rPr>
+          <w:rFonts w:cs="Verdana" w:ascii="Verdana" w:hAnsi="Verdana"/>
+        </w:rPr>
+        <w:t>” and “Unicode”</w:t>
       </w:r>
     </w:p>
     <w:p>
@@ -11440,7 +12116,49 @@
         <w:rPr>
           <w:rFonts w:cs="Verdana" w:ascii="Verdana" w:hAnsi="Verdana"/>
         </w:rPr>
-        <w:t>Version 4.0 supports “Embosser”, “Notetaker” and “Universal Braille device”</w:t>
+        <w:t xml:space="preserve">Version 4.0 supports “Embosser”, “Notetaker”, </w:t>
+      </w:r>
+      <w:r>
+        <w:rPr>
+          <w:rFonts w:cs="Verdana" w:ascii="Verdana" w:hAnsi="Verdana"/>
+          <w:color w:val="C9211E"/>
+        </w:rPr>
+        <w:t>“</w:t>
+      </w:r>
+      <w:r>
+        <w:rPr>
+          <w:rFonts w:cs="Verdana" w:ascii="Verdana" w:hAnsi="Verdana"/>
+          <w:color w:val="C9211E"/>
+        </w:rPr>
+        <w:t>Braillo 650 SF</w:t>
+      </w:r>
+      <w:r>
+        <w:rPr>
+          <w:rFonts w:cs="Verdana" w:ascii="Verdana" w:hAnsi="Verdana"/>
+          <w:color w:val="C9211E"/>
+        </w:rPr>
+        <w:t>”</w:t>
+      </w:r>
+      <w:r>
+        <w:rPr>
+          <w:rFonts w:cs="Verdana" w:ascii="Verdana" w:hAnsi="Verdana"/>
+        </w:rPr>
+        <w:t xml:space="preserve"> and “Universal Braille device”</w:t>
+      </w:r>
+    </w:p>
+    <w:p>
+      <w:pPr>
+        <w:pStyle w:val="Normal"/>
+        <w:rPr>
+          <w:color w:val="C9211E"/>
+        </w:rPr>
+      </w:pPr>
+      <w:r>
+        <w:rPr>
+          <w:rFonts w:cs="Verdana" w:ascii="Verdana" w:hAnsi="Verdana"/>
+          <w:color w:val="C9211E"/>
+        </w:rPr>
+        <w:t>The user can change the names of the devices, for instance to the name of the user’s own, specific embosser.</w:t>
       </w:r>
     </w:p>
     <w:p>
@@ -11800,39 +12518,15 @@
               <w:jc w:val="left"/>
               <w:rPr>
                 <w:rFonts w:ascii="Liberation Serif" w:hAnsi="Liberation Serif"/>
-                <w:b w:val="false"/>
-                <w:b w:val="false"/>
-                <w:bCs w:val="false"/>
-                <w:i w:val="false"/>
-                <w:i w:val="false"/>
-                <w:iCs w:val="false"/>
-                <w:strike w:val="false"/>
-                <w:dstrike w:val="false"/>
-                <w:outline w:val="false"/>
-                <w:shadow w:val="false"/>
-                <w:color w:val="000000"/>
-                <w:sz w:val="24"/>
-                <w:szCs w:val="24"/>
-                <w:u w:val="none"/>
+                <w:color w:val="C9211E"/>
               </w:rPr>
             </w:pPr>
             <w:r>
               <w:rPr>
                 <w:rFonts w:ascii="Liberation Serif" w:hAnsi="Liberation Serif"/>
-                <w:b w:val="false"/>
-                <w:bCs w:val="false"/>
-                <w:i w:val="false"/>
-                <w:iCs w:val="false"/>
-                <w:strike w:val="false"/>
-                <w:dstrike w:val="false"/>
-                <w:outline w:val="false"/>
-                <w:shadow w:val="false"/>
-                <w:color w:val="000000"/>
-                <w:sz w:val="24"/>
-                <w:szCs w:val="24"/>
-                <w:u w:val="none"/>
-              </w:rPr>
-              <w:t>Universal Braille device</w:t>
+                <w:color w:val="C9211E"/>
+              </w:rPr>
+              <w:t>High speed embosser</w:t>
             </w:r>
           </w:p>
         </w:tc>
@@ -11843,6 +12537,36 @@
               <w:left w:val="single" w:sz="4" w:space="0" w:color="000000"/>
               <w:bottom w:val="single" w:sz="4" w:space="0" w:color="000000"/>
               <w:right w:val="single" w:sz="4" w:space="0" w:color="000000"/>
+            </w:tcBorders>
+            <w:shd w:fill="auto" w:val="clear"/>
+          </w:tcPr>
+          <w:p>
+            <w:pPr>
+              <w:pStyle w:val="Tabelindhold"/>
+              <w:jc w:val="left"/>
+              <w:rPr>
+                <w:rFonts w:ascii="Liberation Serif" w:hAnsi="Liberation Serif"/>
+                <w:color w:val="C9211E"/>
+              </w:rPr>
+            </w:pPr>
+            <w:r>
+              <w:rPr>
+                <w:rFonts w:ascii="Liberation Serif" w:hAnsi="Liberation Serif"/>
+                <w:color w:val="C9211E"/>
+              </w:rPr>
+              <w:t>Typical parameters for a high speed embosser. The name “Braille 650 SF” is the name of the high speed embosser used by the NOTA institute in Denmark</w:t>
+            </w:r>
+          </w:p>
+        </w:tc>
+      </w:tr>
+      <w:tr>
+        <w:trPr/>
+        <w:tc>
+          <w:tcPr>
+            <w:tcW w:w="2604" w:type="dxa"/>
+            <w:tcBorders>
+              <w:left w:val="single" w:sz="4" w:space="0" w:color="000000"/>
+              <w:bottom w:val="single" w:sz="4" w:space="0" w:color="000000"/>
             </w:tcBorders>
             <w:shd w:fill="auto" w:val="clear"/>
           </w:tcPr>
@@ -11884,6 +12608,58 @@
                 <w:szCs w:val="24"/>
                 <w:u w:val="none"/>
               </w:rPr>
+              <w:t>Universal Braille device</w:t>
+            </w:r>
+          </w:p>
+        </w:tc>
+        <w:tc>
+          <w:tcPr>
+            <w:tcW w:w="6421" w:type="dxa"/>
+            <w:tcBorders>
+              <w:left w:val="single" w:sz="4" w:space="0" w:color="000000"/>
+              <w:bottom w:val="single" w:sz="4" w:space="0" w:color="000000"/>
+              <w:right w:val="single" w:sz="4" w:space="0" w:color="000000"/>
+            </w:tcBorders>
+            <w:shd w:fill="auto" w:val="clear"/>
+          </w:tcPr>
+          <w:p>
+            <w:pPr>
+              <w:pStyle w:val="Tabelindhold"/>
+              <w:jc w:val="left"/>
+              <w:rPr>
+                <w:rFonts w:ascii="Liberation Serif" w:hAnsi="Liberation Serif"/>
+                <w:b w:val="false"/>
+                <w:b w:val="false"/>
+                <w:bCs w:val="false"/>
+                <w:i w:val="false"/>
+                <w:i w:val="false"/>
+                <w:iCs w:val="false"/>
+                <w:strike w:val="false"/>
+                <w:dstrike w:val="false"/>
+                <w:outline w:val="false"/>
+                <w:shadow w:val="false"/>
+                <w:color w:val="000000"/>
+                <w:sz w:val="24"/>
+                <w:szCs w:val="24"/>
+                <w:u w:val="none"/>
+              </w:rPr>
+            </w:pPr>
+            <w:r>
+              <w:rPr>
+                <w:rFonts w:ascii="Liberation Serif" w:hAnsi="Liberation Serif"/>
+                <w:b w:val="false"/>
+                <w:bCs w:val="false"/>
+                <w:i w:val="false"/>
+                <w:iCs w:val="false"/>
+                <w:strike w:val="false"/>
+                <w:dstrike w:val="false"/>
+                <w:outline w:val="false"/>
+                <w:shadow w:val="false"/>
+                <w:color w:val="000000"/>
+                <w:sz w:val="24"/>
+                <w:szCs w:val="24"/>
+                <w:u w:val="none"/>
+              </w:rPr>
               <w:t>Can be used for special devices or device settings. Can also be used if the user owns 2 different embossers or 2 different notetakers.</w:t>
             </w:r>
           </w:p>
@@ -12168,19 +12944,6 @@
     <w:p>
       <w:pPr>
         <w:pStyle w:val="Normal"/>
-        <w:rPr>
-          <w:rFonts w:ascii="Verdana" w:hAnsi="Verdana" w:cs="Verdana"/>
-        </w:rPr>
-      </w:pPr>
-      <w:r>
-        <w:rPr>
-          <w:rFonts w:cs="Verdana" w:ascii="Verdana" w:hAnsi="Verdana"/>
-        </w:rPr>
-      </w:r>
-    </w:p>
-    <w:p>
-      <w:pPr>
-        <w:pStyle w:val="Normal"/>
         <w:rPr/>
       </w:pPr>
       <w:r>
@@ -12309,14 +13072,14 @@
     <w:p>
       <w:pPr>
         <w:pStyle w:val="Normal"/>
-        <w:rPr>
-          <w:rFonts w:ascii="Verdana" w:hAnsi="Verdana" w:cs="Verdana"/>
-        </w:rPr>
-      </w:pPr>
-      <w:r>
-        <w:rPr>
-          <w:rFonts w:cs="Verdana" w:ascii="Verdana" w:hAnsi="Verdana"/>
-        </w:rPr>
+        <w:rPr/>
+      </w:pPr>
+      <w:r>
+        <w:rPr>
+          <w:rFonts w:cs="Verdana" w:ascii="Verdana" w:hAnsi="Verdana"/>
+          <w:color w:val="C9211E"/>
+        </w:rPr>
+        <w:t>Starting with version 5.0.0.0 the user can also browse the contents of the Music Braille files generated by opening them one at a time by “IBOS Music Braille Reader”</w:t>
       </w:r>
       <w:r>
         <w:br w:type="page"/>
@@ -15275,14 +16038,14 @@
         </w:tblCellMar>
       </w:tblPr>
       <w:tblGrid>
-        <w:gridCol w:w="2152"/>
-        <w:gridCol w:w="6802"/>
+        <w:gridCol w:w="2151"/>
+        <w:gridCol w:w="6803"/>
       </w:tblGrid>
       <w:tr>
         <w:trPr/>
         <w:tc>
           <w:tcPr>
-            <w:tcW w:w="2152" w:type="dxa"/>
+            <w:tcW w:w="2151" w:type="dxa"/>
             <w:tcBorders/>
             <w:shd w:fill="auto" w:val="clear"/>
           </w:tcPr>
@@ -15307,7 +16070,7 @@
         </w:tc>
         <w:tc>
           <w:tcPr>
-            <w:tcW w:w="6802" w:type="dxa"/>
+            <w:tcW w:w="6803" w:type="dxa"/>
             <w:tcBorders/>
             <w:shd w:fill="auto" w:val="clear"/>
           </w:tcPr>
@@ -15333,7 +16096,7 @@
         <w:trPr/>
         <w:tc>
           <w:tcPr>
-            <w:tcW w:w="2152" w:type="dxa"/>
+            <w:tcW w:w="2151" w:type="dxa"/>
             <w:tcBorders/>
             <w:shd w:fill="auto" w:val="clear"/>
           </w:tcPr>
@@ -15354,7 +16117,7 @@
         </w:tc>
         <w:tc>
           <w:tcPr>
-            <w:tcW w:w="6802" w:type="dxa"/>
+            <w:tcW w:w="6803" w:type="dxa"/>
             <w:tcBorders/>
             <w:shd w:fill="auto" w:val="clear"/>
           </w:tcPr>
@@ -15378,7 +16141,7 @@
         <w:trPr/>
         <w:tc>
           <w:tcPr>
-            <w:tcW w:w="2152" w:type="dxa"/>
+            <w:tcW w:w="2151" w:type="dxa"/>
             <w:tcBorders/>
             <w:shd w:fill="auto" w:val="clear"/>
           </w:tcPr>
@@ -15401,7 +16164,7 @@
         </w:tc>
         <w:tc>
           <w:tcPr>
-            <w:tcW w:w="6802" w:type="dxa"/>
+            <w:tcW w:w="6803" w:type="dxa"/>
             <w:tcBorders/>
             <w:shd w:fill="auto" w:val="clear"/>
           </w:tcPr>
@@ -15425,7 +16188,7 @@
         <w:trPr/>
         <w:tc>
           <w:tcPr>
-            <w:tcW w:w="2152" w:type="dxa"/>
+            <w:tcW w:w="2151" w:type="dxa"/>
             <w:tcBorders/>
             <w:shd w:fill="auto" w:val="clear"/>
           </w:tcPr>
@@ -15448,7 +16211,7 @@
         </w:tc>
         <w:tc>
           <w:tcPr>
-            <w:tcW w:w="6802" w:type="dxa"/>
+            <w:tcW w:w="6803" w:type="dxa"/>
             <w:tcBorders/>
             <w:shd w:fill="auto" w:val="clear"/>
           </w:tcPr>
@@ -15473,7 +16236,7 @@
         <w:trPr/>
         <w:tc>
           <w:tcPr>
-            <w:tcW w:w="2152" w:type="dxa"/>
+            <w:tcW w:w="2151" w:type="dxa"/>
             <w:tcBorders/>
             <w:shd w:fill="auto" w:val="clear"/>
           </w:tcPr>
@@ -15496,7 +16259,7 @@
         </w:tc>
         <w:tc>
           <w:tcPr>
-            <w:tcW w:w="6802" w:type="dxa"/>
+            <w:tcW w:w="6803" w:type="dxa"/>
             <w:tcBorders/>
             <w:shd w:fill="auto" w:val="clear"/>
           </w:tcPr>
@@ -15520,7 +16283,7 @@
         <w:trPr/>
         <w:tc>
           <w:tcPr>
-            <w:tcW w:w="2152" w:type="dxa"/>
+            <w:tcW w:w="2151" w:type="dxa"/>
             <w:tcBorders/>
             <w:shd w:fill="auto" w:val="clear"/>
           </w:tcPr>
@@ -15543,7 +16306,7 @@
         </w:tc>
         <w:tc>
           <w:tcPr>
-            <w:tcW w:w="6802" w:type="dxa"/>
+            <w:tcW w:w="6803" w:type="dxa"/>
             <w:tcBorders/>
             <w:shd w:fill="auto" w:val="clear"/>
           </w:tcPr>
@@ -15565,7 +16328,7 @@
         <w:trPr/>
         <w:tc>
           <w:tcPr>
-            <w:tcW w:w="2152" w:type="dxa"/>
+            <w:tcW w:w="2151" w:type="dxa"/>
             <w:tcBorders/>
             <w:shd w:fill="auto" w:val="clear"/>
           </w:tcPr>
@@ -15586,7 +16349,7 @@
         </w:tc>
         <w:tc>
           <w:tcPr>
-            <w:tcW w:w="6802" w:type="dxa"/>
+            <w:tcW w:w="6803" w:type="dxa"/>
             <w:tcBorders/>
             <w:shd w:fill="auto" w:val="clear"/>
           </w:tcPr>
@@ -15612,7 +16375,7 @@
         <w:trPr/>
         <w:tc>
           <w:tcPr>
-            <w:tcW w:w="2152" w:type="dxa"/>
+            <w:tcW w:w="2151" w:type="dxa"/>
             <w:tcBorders/>
             <w:shd w:fill="auto" w:val="clear"/>
           </w:tcPr>
@@ -15633,7 +16396,7 @@
         </w:tc>
         <w:tc>
           <w:tcPr>
-            <w:tcW w:w="6802" w:type="dxa"/>
+            <w:tcW w:w="6803" w:type="dxa"/>
             <w:tcBorders/>
             <w:shd w:fill="auto" w:val="clear"/>
           </w:tcPr>
@@ -15675,7 +16438,7 @@
         <w:trPr/>
         <w:tc>
           <w:tcPr>
-            <w:tcW w:w="2152" w:type="dxa"/>
+            <w:tcW w:w="2151" w:type="dxa"/>
             <w:tcBorders/>
             <w:shd w:fill="auto" w:val="clear"/>
           </w:tcPr>
@@ -15698,7 +16461,7 @@
         </w:tc>
         <w:tc>
           <w:tcPr>
-            <w:tcW w:w="6802" w:type="dxa"/>
+            <w:tcW w:w="6803" w:type="dxa"/>
             <w:tcBorders/>
             <w:shd w:fill="auto" w:val="clear"/>
           </w:tcPr>
@@ -15722,7 +16485,7 @@
         <w:trPr/>
         <w:tc>
           <w:tcPr>
-            <w:tcW w:w="2152" w:type="dxa"/>
+            <w:tcW w:w="2151" w:type="dxa"/>
             <w:tcBorders/>
             <w:shd w:fill="auto" w:val="clear"/>
           </w:tcPr>
@@ -15745,7 +16508,7 @@
         </w:tc>
         <w:tc>
           <w:tcPr>
-            <w:tcW w:w="6802" w:type="dxa"/>
+            <w:tcW w:w="6803" w:type="dxa"/>
             <w:tcBorders/>
             <w:shd w:fill="auto" w:val="clear"/>
           </w:tcPr>
@@ -15767,7 +16530,7 @@
         <w:trPr/>
         <w:tc>
           <w:tcPr>
-            <w:tcW w:w="2152" w:type="dxa"/>
+            <w:tcW w:w="2151" w:type="dxa"/>
             <w:tcBorders/>
             <w:shd w:fill="auto" w:val="clear"/>
           </w:tcPr>
@@ -15790,7 +16553,7 @@
         </w:tc>
         <w:tc>
           <w:tcPr>
-            <w:tcW w:w="6802" w:type="dxa"/>
+            <w:tcW w:w="6803" w:type="dxa"/>
             <w:tcBorders/>
             <w:shd w:fill="auto" w:val="clear"/>
           </w:tcPr>
@@ -15924,7 +16687,31 @@
         <w:rPr>
           <w:rFonts w:cs="Verdana" w:ascii="Verdana" w:hAnsi="Verdana"/>
         </w:rPr>
-        <w:t xml:space="preserve">However, all texts displayed in the user interface, including the program's name, are located so that they appear in Danish to a suer using Danish as default language and in English for a user using English as default language. </w:t>
+        <w:t>However, all texts displayed in the user interface, including the program's name, are loca</w:t>
+      </w:r>
+      <w:r>
+        <w:rPr>
+          <w:rFonts w:cs="Verdana" w:ascii="Verdana" w:hAnsi="Verdana"/>
+        </w:rPr>
+        <w:t>lized</w:t>
+      </w:r>
+      <w:r>
+        <w:rPr>
+          <w:rFonts w:cs="Verdana" w:ascii="Verdana" w:hAnsi="Verdana"/>
+        </w:rPr>
+        <w:t xml:space="preserve"> so that they appear in Danish to a </w:t>
+      </w:r>
+      <w:r>
+        <w:rPr>
+          <w:rFonts w:cs="Verdana" w:ascii="Verdana" w:hAnsi="Verdana"/>
+        </w:rPr>
+        <w:t>us</w:t>
+      </w:r>
+      <w:r>
+        <w:rPr>
+          <w:rFonts w:cs="Verdana" w:ascii="Verdana" w:hAnsi="Verdana"/>
+        </w:rPr>
+        <w:t xml:space="preserve">er using Danish as default language and in English for a user using English as default language. </w:t>
       </w:r>
     </w:p>
     <w:p>
@@ -16206,7 +16993,7 @@
     </w:r>
     <w:r>
       <w:rPr/>
-      <w:t>User's manual for IBOS MusicXmlReader version 4.0.0.0.docx</w:t>
+      <w:t>User's manual for IBOS MusicXmlReader version 5.0.0.0.docx</w:t>
     </w:r>
     <w:r>
       <w:rPr/>

</xml_diff>